<commit_message>
Remove all existing project files
</commit_message>
<xml_diff>
--- a/9a. Admin Panel.docx
+++ b/9a. Admin Panel.docx
@@ -116,6 +116,7 @@
               <w:tab w:val="left" w:pos="480"/>
               <w:tab w:val="right" w:leader="dot" w:pos="9016"/>
             </w:tabs>
+            <w:jc w:val="both"/>
             <w:rPr>
               <w:rFonts w:asciiTheme="minorHAnsi" w:eastAsiaTheme="minorEastAsia" w:hAnsiTheme="minorHAnsi" w:cstheme="minorBidi"/>
               <w:noProof/>
@@ -213,6 +214,7 @@
               <w:tab w:val="left" w:pos="480"/>
               <w:tab w:val="right" w:leader="dot" w:pos="9016"/>
             </w:tabs>
+            <w:jc w:val="both"/>
             <w:rPr>
               <w:rFonts w:asciiTheme="minorHAnsi" w:eastAsiaTheme="minorEastAsia" w:hAnsiTheme="minorHAnsi" w:cstheme="minorBidi"/>
               <w:noProof/>
@@ -301,6 +303,7 @@
               <w:tab w:val="left" w:pos="480"/>
               <w:tab w:val="right" w:leader="dot" w:pos="9016"/>
             </w:tabs>
+            <w:jc w:val="both"/>
             <w:rPr>
               <w:rFonts w:asciiTheme="minorHAnsi" w:eastAsiaTheme="minorEastAsia" w:hAnsiTheme="minorHAnsi" w:cstheme="minorBidi"/>
               <w:noProof/>
@@ -389,6 +392,7 @@
               <w:tab w:val="left" w:pos="960"/>
               <w:tab w:val="right" w:leader="dot" w:pos="9016"/>
             </w:tabs>
+            <w:jc w:val="both"/>
             <w:rPr>
               <w:rFonts w:asciiTheme="minorHAnsi" w:eastAsiaTheme="minorEastAsia" w:hAnsiTheme="minorHAnsi" w:cstheme="minorBidi"/>
               <w:noProof/>
@@ -477,6 +481,7 @@
               <w:tab w:val="left" w:pos="960"/>
               <w:tab w:val="right" w:leader="dot" w:pos="9016"/>
             </w:tabs>
+            <w:jc w:val="both"/>
             <w:rPr>
               <w:rFonts w:asciiTheme="minorHAnsi" w:eastAsiaTheme="minorEastAsia" w:hAnsiTheme="minorHAnsi" w:cstheme="minorBidi"/>
               <w:noProof/>
@@ -565,6 +570,7 @@
               <w:tab w:val="left" w:pos="960"/>
               <w:tab w:val="right" w:leader="dot" w:pos="9016"/>
             </w:tabs>
+            <w:jc w:val="both"/>
             <w:rPr>
               <w:rFonts w:asciiTheme="minorHAnsi" w:eastAsiaTheme="minorEastAsia" w:hAnsiTheme="minorHAnsi" w:cstheme="minorBidi"/>
               <w:noProof/>
@@ -653,6 +659,7 @@
               <w:tab w:val="left" w:pos="960"/>
               <w:tab w:val="right" w:leader="dot" w:pos="9016"/>
             </w:tabs>
+            <w:jc w:val="both"/>
             <w:rPr>
               <w:rFonts w:asciiTheme="minorHAnsi" w:eastAsiaTheme="minorEastAsia" w:hAnsiTheme="minorHAnsi" w:cstheme="minorBidi"/>
               <w:noProof/>
@@ -829,7 +836,19 @@
         <w:rPr>
           <w:rFonts w:cs="Arial"/>
         </w:rPr>
-        <w:t>a main menu for the application</w:t>
+        <w:t>a</w:t>
+      </w:r>
+      <w:r>
+        <w:rPr>
+          <w:rFonts w:cs="Arial"/>
+        </w:rPr>
+        <w:t xml:space="preserve">n admin </w:t>
+      </w:r>
+      <w:r>
+        <w:rPr>
+          <w:rFonts w:cs="Arial"/>
+        </w:rPr>
+        <w:t>menu for the application</w:t>
       </w:r>
       <w:r>
         <w:rPr>
@@ -882,7 +901,37 @@
         <w:jc w:val="both"/>
       </w:pPr>
       <w:r>
-        <w:t>The admin should have a separate menu to implement CRUD across all the database tables and functions. For example, the admin could add new products, update user roles from regular to manager etc. I am now going to show you how to setup a separate menu and implement some of the functionality.</w:t>
+        <w:t xml:space="preserve">The admin should have a separate menu to implement CRUD across all the database tables and functions. For example, the admin could add new </w:t>
+      </w:r>
+      <w:r>
+        <w:t xml:space="preserve">users, products, </w:t>
+      </w:r>
+      <w:r>
+        <w:t xml:space="preserve">update user roles </w:t>
+      </w:r>
+      <w:r>
+        <w:t>(</w:t>
+      </w:r>
+      <w:r>
+        <w:t xml:space="preserve">from </w:t>
+      </w:r>
+      <w:r>
+        <w:t>user</w:t>
+      </w:r>
+      <w:r>
+        <w:t xml:space="preserve"> to manager</w:t>
+      </w:r>
+      <w:r>
+        <w:t>)</w:t>
+      </w:r>
+      <w:r>
+        <w:t xml:space="preserve"> etc. I am now going to show you how to setup a separate menu and implement </w:t>
+      </w:r>
+      <w:r>
+        <w:t>admin</w:t>
+      </w:r>
+      <w:r>
+        <w:t xml:space="preserve"> functionality.</w:t>
       </w:r>
     </w:p>
     <w:p>
@@ -916,29 +965,98 @@
       <w:bookmarkEnd w:id="3"/>
     </w:p>
     <w:p>
-      <w:r>
-        <w:t>We did have different menu items for regular and manager users. We checked the user role and determined if we should display the menu item or not. This time, I am going to create a completely different menu for the admin i.e. separate file.</w:t>
-      </w:r>
-    </w:p>
-    <w:p/>
-    <w:p>
-      <w:r>
-        <w:t>I am going to create a separate menu for regular users and admin users. I am going to create a separate component/file for each menu. Then, in the layout file, I will determine which menu to show.</w:t>
-      </w:r>
-    </w:p>
-    <w:p/>
+      <w:pPr>
+        <w:jc w:val="both"/>
+      </w:pPr>
+      <w:r>
+        <w:t>Previously, w</w:t>
+      </w:r>
+      <w:r>
+        <w:t xml:space="preserve">e </w:t>
+      </w:r>
+      <w:r>
+        <w:t>had</w:t>
+      </w:r>
+      <w:r>
+        <w:t xml:space="preserve"> </w:t>
+      </w:r>
+      <w:r>
+        <w:t xml:space="preserve">a </w:t>
+      </w:r>
+      <w:r>
+        <w:t xml:space="preserve">different menu </w:t>
+      </w:r>
+      <w:r>
+        <w:t>option</w:t>
+      </w:r>
+      <w:r>
+        <w:t xml:space="preserve"> </w:t>
+      </w:r>
+      <w:r>
+        <w:t>shown (add product) when</w:t>
+      </w:r>
+      <w:r>
+        <w:t xml:space="preserve"> </w:t>
+      </w:r>
+      <w:r>
+        <w:t xml:space="preserve">the </w:t>
+      </w:r>
+      <w:r>
+        <w:t>user</w:t>
+      </w:r>
+      <w:r>
+        <w:t xml:space="preserve"> role was “manager”</w:t>
+      </w:r>
+      <w:r>
+        <w:t xml:space="preserve">. We checked the user role </w:t>
+      </w:r>
+      <w:r>
+        <w:t>to</w:t>
+      </w:r>
+      <w:r>
+        <w:t xml:space="preserve"> determine if we should display the menu </w:t>
+      </w:r>
+      <w:r>
+        <w:t>option</w:t>
+      </w:r>
+      <w:r>
+        <w:t>. This time, I am going to create a completely different menu for the admin i.e. separate file.</w:t>
+      </w:r>
+    </w:p>
+    <w:p>
+      <w:pPr>
+        <w:jc w:val="both"/>
+      </w:pPr>
+    </w:p>
+    <w:p>
+      <w:pPr>
+        <w:jc w:val="both"/>
+      </w:pPr>
+      <w:r>
+        <w:t>I am going to create a separate menu for regular users and admin users. I am going to create a separate component for each menu. Then, in the layout file, I will determine which menu to show.</w:t>
+      </w:r>
+    </w:p>
+    <w:p>
+      <w:pPr>
+        <w:jc w:val="both"/>
+      </w:pPr>
+    </w:p>
     <w:p>
       <w:pPr>
         <w:pStyle w:val="Heading2"/>
+        <w:jc w:val="both"/>
       </w:pPr>
       <w:bookmarkStart w:id="4" w:name="_Toc222413902"/>
+      <w:proofErr w:type="spellStart"/>
       <w:r>
         <w:t>MainMenu.svelte</w:t>
       </w:r>
       <w:bookmarkEnd w:id="4"/>
-    </w:p>
-    <w:p>
-      <w:pPr>
+      <w:proofErr w:type="spellEnd"/>
+    </w:p>
+    <w:p>
+      <w:pPr>
+        <w:jc w:val="both"/>
         <w:rPr>
           <w:b/>
           <w:bCs/>
@@ -957,6 +1075,7 @@
       <w:r>
         <w:t>/component in the directory lib/components/</w:t>
       </w:r>
+      <w:proofErr w:type="spellStart"/>
       <w:r>
         <w:rPr>
           <w:b/>
@@ -964,9 +1083,17 @@
         </w:rPr>
         <w:t>MainMenu.svelte</w:t>
       </w:r>
-    </w:p>
-    <w:p/>
-    <w:p>
+      <w:proofErr w:type="spellEnd"/>
+    </w:p>
+    <w:p>
+      <w:pPr>
+        <w:jc w:val="both"/>
+      </w:pPr>
+    </w:p>
+    <w:p>
+      <w:pPr>
+        <w:jc w:val="both"/>
+      </w:pPr>
       <w:r>
         <w:t>Add the import and get the data passed to this file</w:t>
       </w:r>
@@ -975,6 +1102,7 @@
       <w:pPr>
         <w:shd w:val="clear" w:color="auto" w:fill="1F1F1F"/>
         <w:spacing w:line="285" w:lineRule="atLeast"/>
+        <w:jc w:val="both"/>
         <w:rPr>
           <w:rFonts w:ascii="Consolas" w:hAnsi="Consolas"/>
           <w:color w:val="CCCCCC"/>
@@ -1014,6 +1142,7 @@
       <w:pPr>
         <w:shd w:val="clear" w:color="auto" w:fill="1F1F1F"/>
         <w:spacing w:line="285" w:lineRule="atLeast"/>
+        <w:jc w:val="both"/>
         <w:rPr>
           <w:rFonts w:ascii="Consolas" w:hAnsi="Consolas"/>
           <w:color w:val="CCCCCC"/>
@@ -1107,6 +1236,7 @@
       <w:pPr>
         <w:shd w:val="clear" w:color="auto" w:fill="1F1F1F"/>
         <w:spacing w:line="285" w:lineRule="atLeast"/>
+        <w:jc w:val="both"/>
         <w:rPr>
           <w:rFonts w:ascii="Consolas" w:hAnsi="Consolas"/>
           <w:color w:val="CCCCCC"/>
@@ -1128,6 +1258,7 @@
       <w:pPr>
         <w:shd w:val="clear" w:color="auto" w:fill="1F1F1F"/>
         <w:spacing w:line="285" w:lineRule="atLeast"/>
+        <w:jc w:val="both"/>
         <w:rPr>
           <w:rFonts w:ascii="Consolas" w:hAnsi="Consolas"/>
           <w:color w:val="CCCCCC"/>
@@ -1203,6 +1334,7 @@
       <w:pPr>
         <w:shd w:val="clear" w:color="auto" w:fill="1F1F1F"/>
         <w:spacing w:line="285" w:lineRule="atLeast"/>
+        <w:jc w:val="both"/>
         <w:rPr>
           <w:rFonts w:ascii="Consolas" w:hAnsi="Consolas"/>
           <w:color w:val="CCCCCC"/>
@@ -1238,11 +1370,19 @@
         <w:t>&gt;</w:t>
       </w:r>
     </w:p>
-    <w:p/>
-    <w:p>
+    <w:p>
+      <w:pPr>
+        <w:jc w:val="both"/>
+      </w:pPr>
+    </w:p>
+    <w:p>
+      <w:pPr>
+        <w:jc w:val="both"/>
+      </w:pPr>
       <w:r>
         <w:t>Then, from this existing file, routes/</w:t>
       </w:r>
+      <w:proofErr w:type="spellStart"/>
       <w:r>
         <w:rPr>
           <w:b/>
@@ -1250,15 +1390,31 @@
         </w:rPr>
         <w:t>layout.svelte</w:t>
       </w:r>
-      <w:r>
-        <w:t>, cut the complete header content and paste it into this file.</w:t>
-      </w:r>
-    </w:p>
-    <w:p/>
+      <w:proofErr w:type="spellEnd"/>
+      <w:r>
+        <w:t xml:space="preserve">, </w:t>
+      </w:r>
+      <w:r>
+        <w:rPr>
+          <w:b/>
+          <w:bCs/>
+        </w:rPr>
+        <w:t>cut</w:t>
+      </w:r>
+      <w:r>
+        <w:t xml:space="preserve"> the complete header content and paste it into this file.</w:t>
+      </w:r>
+    </w:p>
+    <w:p>
+      <w:pPr>
+        <w:jc w:val="both"/>
+      </w:pPr>
+    </w:p>
     <w:p>
       <w:pPr>
         <w:shd w:val="clear" w:color="auto" w:fill="1F1F1F"/>
         <w:spacing w:line="285" w:lineRule="atLeast"/>
+        <w:jc w:val="both"/>
         <w:rPr>
           <w:rFonts w:ascii="Consolas" w:hAnsi="Consolas"/>
           <w:color w:val="6A9955"/>
@@ -1280,6 +1436,7 @@
       <w:pPr>
         <w:shd w:val="clear" w:color="auto" w:fill="1F1F1F"/>
         <w:spacing w:line="285" w:lineRule="atLeast"/>
+        <w:jc w:val="both"/>
         <w:rPr>
           <w:rFonts w:ascii="Consolas" w:hAnsi="Consolas"/>
           <w:color w:val="6A9955"/>
@@ -1288,19 +1445,27 @@
         </w:rPr>
       </w:pPr>
     </w:p>
-    <w:p/>
+    <w:p>
+      <w:pPr>
+        <w:jc w:val="both"/>
+      </w:pPr>
+    </w:p>
     <w:p>
       <w:pPr>
         <w:pStyle w:val="Heading2"/>
+        <w:jc w:val="both"/>
       </w:pPr>
       <w:bookmarkStart w:id="5" w:name="_Toc222413903"/>
+      <w:proofErr w:type="spellStart"/>
       <w:r>
         <w:t>AdminMenu.svelte</w:t>
       </w:r>
       <w:bookmarkEnd w:id="5"/>
-    </w:p>
-    <w:p>
-      <w:pPr>
+      <w:proofErr w:type="spellEnd"/>
+    </w:p>
+    <w:p>
+      <w:pPr>
+        <w:jc w:val="both"/>
         <w:rPr>
           <w:b/>
           <w:bCs/>
@@ -1319,6 +1484,7 @@
       <w:r>
         <w:t>/component in the directory lib/components/</w:t>
       </w:r>
+      <w:proofErr w:type="spellStart"/>
       <w:r>
         <w:rPr>
           <w:b/>
@@ -1333,12 +1499,21 @@
         </w:rPr>
         <w:t>Menu.svelte</w:t>
       </w:r>
-    </w:p>
-    <w:p/>
-    <w:p>
+      <w:proofErr w:type="spellEnd"/>
+    </w:p>
+    <w:p>
+      <w:pPr>
+        <w:jc w:val="both"/>
+      </w:pPr>
+    </w:p>
+    <w:p>
+      <w:pPr>
+        <w:jc w:val="both"/>
+      </w:pPr>
       <w:r>
         <w:t xml:space="preserve">This file will be the same as the regular menu, apart from the actual menu options. Therefore, copy and paste the code from </w:t>
       </w:r>
+      <w:proofErr w:type="spellStart"/>
       <w:r>
         <w:rPr>
           <w:b/>
@@ -1346,10 +1521,16 @@
         </w:rPr>
         <w:t>MainMenu.svelte</w:t>
       </w:r>
-    </w:p>
-    <w:p/>
-    <w:p>
-      <w:pPr>
+      <w:proofErr w:type="spellEnd"/>
+    </w:p>
+    <w:p>
+      <w:pPr>
+        <w:jc w:val="both"/>
+      </w:pPr>
+    </w:p>
+    <w:p>
+      <w:pPr>
+        <w:jc w:val="both"/>
         <w:rPr>
           <w:b/>
           <w:bCs/>
@@ -1364,6 +1545,9 @@
       </w:r>
     </w:p>
     <w:p>
+      <w:pPr>
+        <w:jc w:val="both"/>
+      </w:pPr>
       <w:r>
         <w:t xml:space="preserve">Change </w:t>
       </w:r>
@@ -1403,6 +1587,7 @@
       <w:pPr>
         <w:shd w:val="clear" w:color="auto" w:fill="1F1F1F"/>
         <w:spacing w:line="285" w:lineRule="atLeast"/>
+        <w:jc w:val="both"/>
         <w:rPr>
           <w:rFonts w:ascii="Consolas" w:hAnsi="Consolas"/>
           <w:color w:val="CCCCCC"/>
@@ -1424,6 +1609,7 @@
       <w:pPr>
         <w:shd w:val="clear" w:color="auto" w:fill="1F1F1F"/>
         <w:spacing w:line="285" w:lineRule="atLeast"/>
+        <w:jc w:val="both"/>
         <w:rPr>
           <w:rFonts w:ascii="Consolas" w:hAnsi="Consolas"/>
           <w:color w:val="CCCCCC"/>
@@ -1483,7 +1669,27 @@
           <w:sz w:val="21"/>
           <w:szCs w:val="21"/>
         </w:rPr>
-        <w:t>"navbar navbar-expand-md navbar-dark bd-navbar bg-dark"</w:t>
+        <w:t xml:space="preserve">"navbar navbar-expand-md navbar-dark bd-navbar </w:t>
+      </w:r>
+      <w:proofErr w:type="spellStart"/>
+      <w:r>
+        <w:rPr>
+          <w:rFonts w:ascii="Consolas" w:hAnsi="Consolas"/>
+          <w:color w:val="CE9178"/>
+          <w:sz w:val="21"/>
+          <w:szCs w:val="21"/>
+        </w:rPr>
+        <w:t>bg</w:t>
+      </w:r>
+      <w:proofErr w:type="spellEnd"/>
+      <w:r>
+        <w:rPr>
+          <w:rFonts w:ascii="Consolas" w:hAnsi="Consolas"/>
+          <w:color w:val="CE9178"/>
+          <w:sz w:val="21"/>
+          <w:szCs w:val="21"/>
+        </w:rPr>
+        <w:t>-dark"</w:t>
       </w:r>
       <w:r>
         <w:rPr>
@@ -1499,6 +1705,7 @@
       <w:pPr>
         <w:shd w:val="clear" w:color="auto" w:fill="1F1F1F"/>
         <w:spacing w:line="285" w:lineRule="atLeast"/>
+        <w:jc w:val="both"/>
         <w:rPr>
           <w:rFonts w:ascii="Consolas" w:hAnsi="Consolas"/>
           <w:color w:val="CCCCCC"/>
@@ -1567,7 +1774,27 @@
           <w:sz w:val="21"/>
           <w:szCs w:val="21"/>
         </w:rPr>
-        <w:t>"container-xl flex-wrap flex-md-nowrap"</w:t>
+        <w:t>"container-xl flex-wrap flex-md-</w:t>
+      </w:r>
+      <w:proofErr w:type="spellStart"/>
+      <w:r>
+        <w:rPr>
+          <w:rFonts w:ascii="Consolas" w:hAnsi="Consolas"/>
+          <w:color w:val="CE9178"/>
+          <w:sz w:val="21"/>
+          <w:szCs w:val="21"/>
+        </w:rPr>
+        <w:t>nowrap</w:t>
+      </w:r>
+      <w:proofErr w:type="spellEnd"/>
+      <w:r>
+        <w:rPr>
+          <w:rFonts w:ascii="Consolas" w:hAnsi="Consolas"/>
+          <w:color w:val="CE9178"/>
+          <w:sz w:val="21"/>
+          <w:szCs w:val="21"/>
+        </w:rPr>
+        <w:t>"</w:t>
       </w:r>
       <w:r>
         <w:rPr>
@@ -1619,6 +1846,7 @@
       <w:pPr>
         <w:shd w:val="clear" w:color="auto" w:fill="1F1F1F"/>
         <w:spacing w:line="285" w:lineRule="atLeast"/>
+        <w:jc w:val="both"/>
         <w:rPr>
           <w:rFonts w:ascii="Consolas" w:hAnsi="Consolas"/>
           <w:color w:val="CCCCCC"/>
@@ -1703,6 +1931,7 @@
       <w:pPr>
         <w:shd w:val="clear" w:color="auto" w:fill="1F1F1F"/>
         <w:spacing w:line="285" w:lineRule="atLeast"/>
+        <w:jc w:val="both"/>
         <w:rPr>
           <w:rFonts w:ascii="Consolas" w:hAnsi="Consolas"/>
           <w:color w:val="CCCCCC"/>
@@ -1782,6 +2011,7 @@
         </w:rPr>
         <w:t xml:space="preserve"> </w:t>
       </w:r>
+      <w:proofErr w:type="spellStart"/>
       <w:r>
         <w:rPr>
           <w:rFonts w:ascii="Consolas" w:hAnsi="Consolas"/>
@@ -1791,6 +2021,7 @@
         </w:rPr>
         <w:t>href</w:t>
       </w:r>
+      <w:proofErr w:type="spellEnd"/>
       <w:r>
         <w:rPr>
           <w:rFonts w:ascii="Consolas" w:hAnsi="Consolas"/>
@@ -1807,7 +2038,25 @@
           <w:sz w:val="21"/>
           <w:szCs w:val="21"/>
         </w:rPr>
-        <w:t>"/"</w:t>
+        <w:t>"/</w:t>
+      </w:r>
+      <w:r>
+        <w:rPr>
+          <w:rFonts w:ascii="Consolas" w:hAnsi="Consolas"/>
+          <w:color w:val="CE9178"/>
+          <w:sz w:val="21"/>
+          <w:szCs w:val="21"/>
+        </w:rPr>
+        <w:t>admin</w:t>
+      </w:r>
+      <w:r>
+        <w:rPr>
+          <w:rFonts w:ascii="Consolas" w:hAnsi="Consolas"/>
+          <w:color w:val="CE9178"/>
+          <w:sz w:val="21"/>
+          <w:szCs w:val="21"/>
+        </w:rPr>
+        <w:t>"</w:t>
       </w:r>
       <w:r>
         <w:rPr>
@@ -1823,6 +2072,7 @@
       <w:pPr>
         <w:shd w:val="clear" w:color="auto" w:fill="1F1F1F"/>
         <w:spacing w:line="285" w:lineRule="atLeast"/>
+        <w:jc w:val="both"/>
         <w:rPr>
           <w:rFonts w:ascii="Consolas" w:hAnsi="Consolas"/>
           <w:color w:val="CCCCCC"/>
@@ -1848,6 +2098,7 @@
         </w:rPr>
         <w:t>&lt;</w:t>
       </w:r>
+      <w:proofErr w:type="spellStart"/>
       <w:r>
         <w:rPr>
           <w:rFonts w:ascii="Consolas" w:hAnsi="Consolas"/>
@@ -1857,6 +2108,7 @@
         </w:rPr>
         <w:t>i</w:t>
       </w:r>
+      <w:proofErr w:type="spellEnd"/>
       <w:r>
         <w:rPr>
           <w:rFonts w:ascii="Consolas" w:hAnsi="Consolas"/>
@@ -1902,6 +2154,7 @@
         </w:rPr>
         <w:t>&gt;&lt;/</w:t>
       </w:r>
+      <w:proofErr w:type="spellStart"/>
       <w:r>
         <w:rPr>
           <w:rFonts w:ascii="Consolas" w:hAnsi="Consolas"/>
@@ -1911,6 +2164,7 @@
         </w:rPr>
         <w:t>i</w:t>
       </w:r>
+      <w:proofErr w:type="spellEnd"/>
       <w:r>
         <w:rPr>
           <w:rFonts w:ascii="Consolas" w:hAnsi="Consolas"/>
@@ -1934,6 +2188,7 @@
       <w:pPr>
         <w:shd w:val="clear" w:color="auto" w:fill="1F1F1F"/>
         <w:spacing w:line="285" w:lineRule="atLeast"/>
+        <w:jc w:val="both"/>
         <w:rPr>
           <w:rFonts w:ascii="Consolas" w:hAnsi="Consolas"/>
           <w:color w:val="CCCCCC"/>
@@ -1982,6 +2237,7 @@
       <w:pPr>
         <w:shd w:val="clear" w:color="auto" w:fill="1F1F1F"/>
         <w:spacing w:line="285" w:lineRule="atLeast"/>
+        <w:jc w:val="both"/>
         <w:rPr>
           <w:rFonts w:ascii="Consolas" w:hAnsi="Consolas"/>
           <w:color w:val="CCCCCC"/>
@@ -2158,7 +2414,27 @@
           <w:sz w:val="21"/>
           <w:szCs w:val="21"/>
         </w:rPr>
-        <w:t>"#bdNavbar"</w:t>
+        <w:t>"#</w:t>
+      </w:r>
+      <w:proofErr w:type="spellStart"/>
+      <w:r>
+        <w:rPr>
+          <w:rFonts w:ascii="Consolas" w:hAnsi="Consolas"/>
+          <w:color w:val="CE9178"/>
+          <w:sz w:val="21"/>
+          <w:szCs w:val="21"/>
+        </w:rPr>
+        <w:t>bdNavbar</w:t>
+      </w:r>
+      <w:proofErr w:type="spellEnd"/>
+      <w:r>
+        <w:rPr>
+          <w:rFonts w:ascii="Consolas" w:hAnsi="Consolas"/>
+          <w:color w:val="CE9178"/>
+          <w:sz w:val="21"/>
+          <w:szCs w:val="21"/>
+        </w:rPr>
+        <w:t>"</w:t>
       </w:r>
       <w:r>
         <w:rPr>
@@ -2194,7 +2470,27 @@
           <w:sz w:val="21"/>
           <w:szCs w:val="21"/>
         </w:rPr>
-        <w:t>"bdNavbar"</w:t>
+        <w:t>"</w:t>
+      </w:r>
+      <w:proofErr w:type="spellStart"/>
+      <w:r>
+        <w:rPr>
+          <w:rFonts w:ascii="Consolas" w:hAnsi="Consolas"/>
+          <w:color w:val="CE9178"/>
+          <w:sz w:val="21"/>
+          <w:szCs w:val="21"/>
+        </w:rPr>
+        <w:t>bdNavbar</w:t>
+      </w:r>
+      <w:proofErr w:type="spellEnd"/>
+      <w:r>
+        <w:rPr>
+          <w:rFonts w:ascii="Consolas" w:hAnsi="Consolas"/>
+          <w:color w:val="CE9178"/>
+          <w:sz w:val="21"/>
+          <w:szCs w:val="21"/>
+        </w:rPr>
+        <w:t>"</w:t>
       </w:r>
       <w:r>
         <w:rPr>
@@ -2282,6 +2578,7 @@
       <w:pPr>
         <w:shd w:val="clear" w:color="auto" w:fill="1F1F1F"/>
         <w:spacing w:line="285" w:lineRule="atLeast"/>
+        <w:jc w:val="both"/>
         <w:rPr>
           <w:rFonts w:ascii="Consolas" w:hAnsi="Consolas"/>
           <w:color w:val="CCCCCC"/>
@@ -2384,6 +2681,7 @@
       <w:pPr>
         <w:shd w:val="clear" w:color="auto" w:fill="1F1F1F"/>
         <w:spacing w:line="285" w:lineRule="atLeast"/>
+        <w:jc w:val="both"/>
         <w:rPr>
           <w:rFonts w:ascii="Consolas" w:hAnsi="Consolas"/>
           <w:color w:val="CCCCCC"/>
@@ -2432,6 +2730,7 @@
       <w:pPr>
         <w:shd w:val="clear" w:color="auto" w:fill="1F1F1F"/>
         <w:spacing w:line="285" w:lineRule="atLeast"/>
+        <w:jc w:val="both"/>
         <w:rPr>
           <w:rFonts w:ascii="Consolas" w:hAnsi="Consolas"/>
           <w:color w:val="CCCCCC"/>
@@ -2444,6 +2743,7 @@
       <w:pPr>
         <w:shd w:val="clear" w:color="auto" w:fill="1F1F1F"/>
         <w:spacing w:line="285" w:lineRule="atLeast"/>
+        <w:jc w:val="both"/>
         <w:rPr>
           <w:rFonts w:ascii="Consolas" w:hAnsi="Consolas"/>
           <w:color w:val="CCCCCC"/>
@@ -2548,7 +2848,27 @@
           <w:sz w:val="21"/>
           <w:szCs w:val="21"/>
         </w:rPr>
-        <w:t>"navbarNav"</w:t>
+        <w:t>"</w:t>
+      </w:r>
+      <w:proofErr w:type="spellStart"/>
+      <w:r>
+        <w:rPr>
+          <w:rFonts w:ascii="Consolas" w:hAnsi="Consolas"/>
+          <w:color w:val="CE9178"/>
+          <w:sz w:val="21"/>
+          <w:szCs w:val="21"/>
+        </w:rPr>
+        <w:t>navbarNav</w:t>
+      </w:r>
+      <w:proofErr w:type="spellEnd"/>
+      <w:r>
+        <w:rPr>
+          <w:rFonts w:ascii="Consolas" w:hAnsi="Consolas"/>
+          <w:color w:val="CE9178"/>
+          <w:sz w:val="21"/>
+          <w:szCs w:val="21"/>
+        </w:rPr>
+        <w:t>"</w:t>
       </w:r>
       <w:r>
         <w:rPr>
@@ -2564,6 +2884,7 @@
       <w:pPr>
         <w:shd w:val="clear" w:color="auto" w:fill="1F1F1F"/>
         <w:spacing w:line="285" w:lineRule="atLeast"/>
+        <w:jc w:val="both"/>
         <w:rPr>
           <w:rFonts w:ascii="Consolas" w:hAnsi="Consolas"/>
           <w:color w:val="CCCCCC"/>
@@ -2648,6 +2969,7 @@
       <w:pPr>
         <w:shd w:val="clear" w:color="auto" w:fill="1F1F1F"/>
         <w:spacing w:line="285" w:lineRule="atLeast"/>
+        <w:jc w:val="both"/>
         <w:rPr>
           <w:rFonts w:ascii="Consolas" w:hAnsi="Consolas"/>
           <w:color w:val="CCCCCC"/>
@@ -2732,6 +3054,7 @@
       <w:pPr>
         <w:shd w:val="clear" w:color="auto" w:fill="1F1F1F"/>
         <w:spacing w:line="285" w:lineRule="atLeast"/>
+        <w:jc w:val="both"/>
         <w:rPr>
           <w:rFonts w:ascii="Consolas" w:hAnsi="Consolas"/>
           <w:color w:val="CCCCCC"/>
@@ -2800,7 +3123,7 @@
           <w:sz w:val="21"/>
           <w:szCs w:val="21"/>
         </w:rPr>
-        <w:t>"nav-link active"</w:t>
+        <w:t>"nav-link"</w:t>
       </w:r>
       <w:r>
         <w:rPr>
@@ -2811,6 +3134,7 @@
         </w:rPr>
         <w:t xml:space="preserve"> </w:t>
       </w:r>
+      <w:proofErr w:type="spellStart"/>
       <w:r>
         <w:rPr>
           <w:rFonts w:ascii="Consolas" w:hAnsi="Consolas"/>
@@ -2820,6 +3144,7 @@
         </w:rPr>
         <w:t>href</w:t>
       </w:r>
+      <w:proofErr w:type="spellEnd"/>
       <w:r>
         <w:rPr>
           <w:rFonts w:ascii="Consolas" w:hAnsi="Consolas"/>
@@ -2836,7 +3161,7 @@
           <w:sz w:val="21"/>
           <w:szCs w:val="21"/>
         </w:rPr>
-        <w:t>"/admin"</w:t>
+        <w:t>"/admin/products"</w:t>
       </w:r>
       <w:r>
         <w:rPr>
@@ -2847,6 +3172,7 @@
         </w:rPr>
         <w:t>&gt;&lt;</w:t>
       </w:r>
+      <w:proofErr w:type="spellStart"/>
       <w:r>
         <w:rPr>
           <w:rFonts w:ascii="Consolas" w:hAnsi="Consolas"/>
@@ -2856,6 +3182,7 @@
         </w:rPr>
         <w:t>i</w:t>
       </w:r>
+      <w:proofErr w:type="spellEnd"/>
       <w:r>
         <w:rPr>
           <w:rFonts w:ascii="Consolas" w:hAnsi="Consolas"/>
@@ -2890,7 +3217,7 @@
           <w:sz w:val="21"/>
           <w:szCs w:val="21"/>
         </w:rPr>
-        <w:t>"bi bi-house me-1"</w:t>
+        <w:t>"bi bi-shop me-1"</w:t>
       </w:r>
       <w:r>
         <w:rPr>
@@ -2901,6 +3228,7 @@
         </w:rPr>
         <w:t>&gt;&lt;/</w:t>
       </w:r>
+      <w:proofErr w:type="spellStart"/>
       <w:r>
         <w:rPr>
           <w:rFonts w:ascii="Consolas" w:hAnsi="Consolas"/>
@@ -2910,6 +3238,7 @@
         </w:rPr>
         <w:t>i</w:t>
       </w:r>
+      <w:proofErr w:type="spellEnd"/>
       <w:r>
         <w:rPr>
           <w:rFonts w:ascii="Consolas" w:hAnsi="Consolas"/>
@@ -2926,7 +3255,7 @@
           <w:sz w:val="21"/>
           <w:szCs w:val="21"/>
         </w:rPr>
-        <w:t>Home</w:t>
+        <w:t>Products</w:t>
       </w:r>
       <w:r>
         <w:rPr>
@@ -2960,6 +3289,7 @@
       <w:pPr>
         <w:shd w:val="clear" w:color="auto" w:fill="1F1F1F"/>
         <w:spacing w:line="285" w:lineRule="atLeast"/>
+        <w:jc w:val="both"/>
         <w:rPr>
           <w:rFonts w:ascii="Consolas" w:hAnsi="Consolas"/>
           <w:color w:val="CCCCCC"/>
@@ -3008,6 +3338,7 @@
       <w:pPr>
         <w:shd w:val="clear" w:color="auto" w:fill="1F1F1F"/>
         <w:spacing w:line="285" w:lineRule="atLeast"/>
+        <w:jc w:val="both"/>
         <w:rPr>
           <w:rFonts w:ascii="Consolas" w:hAnsi="Consolas"/>
           <w:color w:val="CCCCCC"/>
@@ -3092,6 +3423,7 @@
       <w:pPr>
         <w:shd w:val="clear" w:color="auto" w:fill="1F1F1F"/>
         <w:spacing w:line="285" w:lineRule="atLeast"/>
+        <w:jc w:val="both"/>
         <w:rPr>
           <w:rFonts w:ascii="Consolas" w:hAnsi="Consolas"/>
           <w:color w:val="CCCCCC"/>
@@ -3171,6 +3503,7 @@
         </w:rPr>
         <w:t xml:space="preserve"> </w:t>
       </w:r>
+      <w:proofErr w:type="spellStart"/>
       <w:r>
         <w:rPr>
           <w:rFonts w:ascii="Consolas" w:hAnsi="Consolas"/>
@@ -3180,6 +3513,7 @@
         </w:rPr>
         <w:t>href</w:t>
       </w:r>
+      <w:proofErr w:type="spellEnd"/>
       <w:r>
         <w:rPr>
           <w:rFonts w:ascii="Consolas" w:hAnsi="Consolas"/>
@@ -3196,7 +3530,7 @@
           <w:sz w:val="21"/>
           <w:szCs w:val="21"/>
         </w:rPr>
-        <w:t>"/admin/products"</w:t>
+        <w:t>"/admin/categories"</w:t>
       </w:r>
       <w:r>
         <w:rPr>
@@ -3207,6 +3541,7 @@
         </w:rPr>
         <w:t>&gt;&lt;</w:t>
       </w:r>
+      <w:proofErr w:type="spellStart"/>
       <w:r>
         <w:rPr>
           <w:rFonts w:ascii="Consolas" w:hAnsi="Consolas"/>
@@ -3216,6 +3551,7 @@
         </w:rPr>
         <w:t>i</w:t>
       </w:r>
+      <w:proofErr w:type="spellEnd"/>
       <w:r>
         <w:rPr>
           <w:rFonts w:ascii="Consolas" w:hAnsi="Consolas"/>
@@ -3250,7 +3586,7 @@
           <w:sz w:val="21"/>
           <w:szCs w:val="21"/>
         </w:rPr>
-        <w:t>"bi bi-shop me-1"</w:t>
+        <w:t>"bi bi-list-columns me-1"</w:t>
       </w:r>
       <w:r>
         <w:rPr>
@@ -3261,6 +3597,7 @@
         </w:rPr>
         <w:t>&gt;&lt;/</w:t>
       </w:r>
+      <w:proofErr w:type="spellStart"/>
       <w:r>
         <w:rPr>
           <w:rFonts w:ascii="Consolas" w:hAnsi="Consolas"/>
@@ -3270,6 +3607,7 @@
         </w:rPr>
         <w:t>i</w:t>
       </w:r>
+      <w:proofErr w:type="spellEnd"/>
       <w:r>
         <w:rPr>
           <w:rFonts w:ascii="Consolas" w:hAnsi="Consolas"/>
@@ -3286,7 +3624,7 @@
           <w:sz w:val="21"/>
           <w:szCs w:val="21"/>
         </w:rPr>
-        <w:t>Products</w:t>
+        <w:t>Categories</w:t>
       </w:r>
       <w:r>
         <w:rPr>
@@ -3320,6 +3658,7 @@
       <w:pPr>
         <w:shd w:val="clear" w:color="auto" w:fill="1F1F1F"/>
         <w:spacing w:line="285" w:lineRule="atLeast"/>
+        <w:jc w:val="both"/>
         <w:rPr>
           <w:rFonts w:ascii="Consolas" w:hAnsi="Consolas"/>
           <w:color w:val="CCCCCC"/>
@@ -3366,376 +3705,29 @@
     </w:p>
     <w:p>
       <w:pPr>
-        <w:shd w:val="clear" w:color="auto" w:fill="1F1F1F"/>
-        <w:spacing w:line="285" w:lineRule="atLeast"/>
-        <w:rPr>
-          <w:rFonts w:ascii="Consolas" w:hAnsi="Consolas"/>
-          <w:color w:val="CCCCCC"/>
-          <w:sz w:val="21"/>
-          <w:szCs w:val="21"/>
-        </w:rPr>
-      </w:pPr>
-      <w:r>
-        <w:rPr>
-          <w:rFonts w:ascii="Consolas" w:hAnsi="Consolas"/>
-          <w:color w:val="CCCCCC"/>
-          <w:sz w:val="21"/>
-          <w:szCs w:val="21"/>
-        </w:rPr>
-        <w:t xml:space="preserve">                    </w:t>
-      </w:r>
-      <w:r>
-        <w:rPr>
-          <w:rFonts w:ascii="Consolas" w:hAnsi="Consolas"/>
-          <w:color w:val="808080"/>
-          <w:sz w:val="21"/>
-          <w:szCs w:val="21"/>
-        </w:rPr>
-        <w:t>&lt;</w:t>
-      </w:r>
-      <w:r>
-        <w:rPr>
-          <w:rFonts w:ascii="Consolas" w:hAnsi="Consolas"/>
-          <w:color w:val="569CD6"/>
-          <w:sz w:val="21"/>
-          <w:szCs w:val="21"/>
-        </w:rPr>
-        <w:t>li</w:t>
-      </w:r>
-      <w:r>
-        <w:rPr>
-          <w:rFonts w:ascii="Consolas" w:hAnsi="Consolas"/>
-          <w:color w:val="CCCCCC"/>
-          <w:sz w:val="21"/>
-          <w:szCs w:val="21"/>
-        </w:rPr>
-        <w:t xml:space="preserve"> </w:t>
-      </w:r>
-      <w:r>
-        <w:rPr>
-          <w:rFonts w:ascii="Consolas" w:hAnsi="Consolas"/>
-          <w:color w:val="9CDCFE"/>
-          <w:sz w:val="21"/>
-          <w:szCs w:val="21"/>
-        </w:rPr>
-        <w:t>class</w:t>
-      </w:r>
-      <w:r>
-        <w:rPr>
-          <w:rFonts w:ascii="Consolas" w:hAnsi="Consolas"/>
-          <w:color w:val="CCCCCC"/>
-          <w:sz w:val="21"/>
-          <w:szCs w:val="21"/>
-        </w:rPr>
-        <w:t>=</w:t>
-      </w:r>
-      <w:r>
-        <w:rPr>
-          <w:rFonts w:ascii="Consolas" w:hAnsi="Consolas"/>
-          <w:color w:val="CE9178"/>
-          <w:sz w:val="21"/>
-          <w:szCs w:val="21"/>
-        </w:rPr>
-        <w:t>"nav-item"</w:t>
-      </w:r>
-      <w:r>
-        <w:rPr>
-          <w:rFonts w:ascii="Consolas" w:hAnsi="Consolas"/>
-          <w:color w:val="808080"/>
-          <w:sz w:val="21"/>
-          <w:szCs w:val="21"/>
-        </w:rPr>
-        <w:t>&gt;</w:t>
-      </w:r>
-    </w:p>
-    <w:p>
-      <w:pPr>
-        <w:shd w:val="clear" w:color="auto" w:fill="1F1F1F"/>
-        <w:spacing w:line="285" w:lineRule="atLeast"/>
-        <w:rPr>
-          <w:rFonts w:ascii="Consolas" w:hAnsi="Consolas"/>
-          <w:color w:val="CCCCCC"/>
-          <w:sz w:val="21"/>
-          <w:szCs w:val="21"/>
-        </w:rPr>
-      </w:pPr>
-      <w:r>
-        <w:rPr>
-          <w:rFonts w:ascii="Consolas" w:hAnsi="Consolas"/>
-          <w:color w:val="CCCCCC"/>
-          <w:sz w:val="21"/>
-          <w:szCs w:val="21"/>
-        </w:rPr>
-        <w:t xml:space="preserve">                        </w:t>
-      </w:r>
-      <w:r>
-        <w:rPr>
-          <w:rFonts w:ascii="Consolas" w:hAnsi="Consolas"/>
-          <w:color w:val="808080"/>
-          <w:sz w:val="21"/>
-          <w:szCs w:val="21"/>
-        </w:rPr>
-        <w:t>&lt;</w:t>
-      </w:r>
-      <w:r>
-        <w:rPr>
-          <w:rFonts w:ascii="Consolas" w:hAnsi="Consolas"/>
-          <w:color w:val="569CD6"/>
-          <w:sz w:val="21"/>
-          <w:szCs w:val="21"/>
-        </w:rPr>
-        <w:t>a</w:t>
-      </w:r>
-      <w:r>
-        <w:rPr>
-          <w:rFonts w:ascii="Consolas" w:hAnsi="Consolas"/>
-          <w:color w:val="CCCCCC"/>
-          <w:sz w:val="21"/>
-          <w:szCs w:val="21"/>
-        </w:rPr>
-        <w:t xml:space="preserve"> </w:t>
-      </w:r>
-      <w:r>
-        <w:rPr>
-          <w:rFonts w:ascii="Consolas" w:hAnsi="Consolas"/>
-          <w:color w:val="9CDCFE"/>
-          <w:sz w:val="21"/>
-          <w:szCs w:val="21"/>
-        </w:rPr>
-        <w:t>class</w:t>
-      </w:r>
-      <w:r>
-        <w:rPr>
-          <w:rFonts w:ascii="Consolas" w:hAnsi="Consolas"/>
-          <w:color w:val="CCCCCC"/>
-          <w:sz w:val="21"/>
-          <w:szCs w:val="21"/>
-        </w:rPr>
-        <w:t>=</w:t>
-      </w:r>
-      <w:r>
-        <w:rPr>
-          <w:rFonts w:ascii="Consolas" w:hAnsi="Consolas"/>
-          <w:color w:val="CE9178"/>
-          <w:sz w:val="21"/>
-          <w:szCs w:val="21"/>
-        </w:rPr>
-        <w:t>"nav-link"</w:t>
-      </w:r>
-      <w:r>
-        <w:rPr>
-          <w:rFonts w:ascii="Consolas" w:hAnsi="Consolas"/>
-          <w:color w:val="CCCCCC"/>
-          <w:sz w:val="21"/>
-          <w:szCs w:val="21"/>
-        </w:rPr>
-        <w:t xml:space="preserve"> </w:t>
-      </w:r>
-      <w:r>
-        <w:rPr>
-          <w:rFonts w:ascii="Consolas" w:hAnsi="Consolas"/>
-          <w:color w:val="9CDCFE"/>
-          <w:sz w:val="21"/>
-          <w:szCs w:val="21"/>
-        </w:rPr>
-        <w:t>href</w:t>
-      </w:r>
-      <w:r>
-        <w:rPr>
-          <w:rFonts w:ascii="Consolas" w:hAnsi="Consolas"/>
-          <w:color w:val="CCCCCC"/>
-          <w:sz w:val="21"/>
-          <w:szCs w:val="21"/>
-        </w:rPr>
-        <w:t>=</w:t>
-      </w:r>
-      <w:r>
-        <w:rPr>
-          <w:rFonts w:ascii="Consolas" w:hAnsi="Consolas"/>
-          <w:color w:val="CE9178"/>
-          <w:sz w:val="21"/>
-          <w:szCs w:val="21"/>
-        </w:rPr>
-        <w:t>"/admin/categories"</w:t>
-      </w:r>
-      <w:r>
-        <w:rPr>
-          <w:rFonts w:ascii="Consolas" w:hAnsi="Consolas"/>
-          <w:color w:val="808080"/>
-          <w:sz w:val="21"/>
-          <w:szCs w:val="21"/>
-        </w:rPr>
-        <w:t>&gt;&lt;</w:t>
-      </w:r>
-      <w:r>
-        <w:rPr>
-          <w:rFonts w:ascii="Consolas" w:hAnsi="Consolas"/>
-          <w:color w:val="569CD6"/>
-          <w:sz w:val="21"/>
-          <w:szCs w:val="21"/>
-        </w:rPr>
-        <w:t>i</w:t>
-      </w:r>
-      <w:r>
-        <w:rPr>
-          <w:rFonts w:ascii="Consolas" w:hAnsi="Consolas"/>
-          <w:color w:val="CCCCCC"/>
-          <w:sz w:val="21"/>
-          <w:szCs w:val="21"/>
-        </w:rPr>
-        <w:t xml:space="preserve"> </w:t>
-      </w:r>
-      <w:r>
-        <w:rPr>
-          <w:rFonts w:ascii="Consolas" w:hAnsi="Consolas"/>
-          <w:color w:val="9CDCFE"/>
-          <w:sz w:val="21"/>
-          <w:szCs w:val="21"/>
-        </w:rPr>
-        <w:t>class</w:t>
-      </w:r>
-      <w:r>
-        <w:rPr>
-          <w:rFonts w:ascii="Consolas" w:hAnsi="Consolas"/>
-          <w:color w:val="CCCCCC"/>
-          <w:sz w:val="21"/>
-          <w:szCs w:val="21"/>
-        </w:rPr>
-        <w:t>=</w:t>
-      </w:r>
-      <w:r>
-        <w:rPr>
-          <w:rFonts w:ascii="Consolas" w:hAnsi="Consolas"/>
-          <w:color w:val="CE9178"/>
-          <w:sz w:val="21"/>
-          <w:szCs w:val="21"/>
-        </w:rPr>
-        <w:t>"bi bi-list-columns me-1"</w:t>
-      </w:r>
-      <w:r>
-        <w:rPr>
-          <w:rFonts w:ascii="Consolas" w:hAnsi="Consolas"/>
-          <w:color w:val="808080"/>
-          <w:sz w:val="21"/>
-          <w:szCs w:val="21"/>
-        </w:rPr>
-        <w:t>&gt;&lt;/</w:t>
-      </w:r>
-      <w:r>
-        <w:rPr>
-          <w:rFonts w:ascii="Consolas" w:hAnsi="Consolas"/>
-          <w:color w:val="569CD6"/>
-          <w:sz w:val="21"/>
-          <w:szCs w:val="21"/>
-        </w:rPr>
-        <w:t>i</w:t>
-      </w:r>
-      <w:r>
-        <w:rPr>
-          <w:rFonts w:ascii="Consolas" w:hAnsi="Consolas"/>
-          <w:color w:val="808080"/>
-          <w:sz w:val="21"/>
-          <w:szCs w:val="21"/>
-        </w:rPr>
-        <w:t>&gt;</w:t>
-      </w:r>
-      <w:r>
-        <w:rPr>
-          <w:rFonts w:ascii="Consolas" w:hAnsi="Consolas"/>
-          <w:color w:val="CCCCCC"/>
-          <w:sz w:val="21"/>
-          <w:szCs w:val="21"/>
-        </w:rPr>
-        <w:t>Categories</w:t>
-      </w:r>
-      <w:r>
-        <w:rPr>
-          <w:rFonts w:ascii="Consolas" w:hAnsi="Consolas"/>
-          <w:color w:val="808080"/>
-          <w:sz w:val="21"/>
-          <w:szCs w:val="21"/>
-        </w:rPr>
-        <w:t>&lt;/</w:t>
-      </w:r>
-      <w:r>
-        <w:rPr>
-          <w:rFonts w:ascii="Consolas" w:hAnsi="Consolas"/>
-          <w:color w:val="569CD6"/>
-          <w:sz w:val="21"/>
-          <w:szCs w:val="21"/>
-        </w:rPr>
-        <w:t>a</w:t>
-      </w:r>
-      <w:r>
-        <w:rPr>
-          <w:rFonts w:ascii="Consolas" w:hAnsi="Consolas"/>
-          <w:color w:val="808080"/>
-          <w:sz w:val="21"/>
-          <w:szCs w:val="21"/>
-        </w:rPr>
-        <w:t>&gt;</w:t>
-      </w:r>
-    </w:p>
-    <w:p>
-      <w:pPr>
-        <w:shd w:val="clear" w:color="auto" w:fill="1F1F1F"/>
-        <w:spacing w:line="285" w:lineRule="atLeast"/>
-        <w:rPr>
-          <w:rFonts w:ascii="Consolas" w:hAnsi="Consolas"/>
-          <w:color w:val="CCCCCC"/>
-          <w:sz w:val="21"/>
-          <w:szCs w:val="21"/>
-        </w:rPr>
-      </w:pPr>
-      <w:r>
-        <w:rPr>
-          <w:rFonts w:ascii="Consolas" w:hAnsi="Consolas"/>
-          <w:color w:val="CCCCCC"/>
-          <w:sz w:val="21"/>
-          <w:szCs w:val="21"/>
-        </w:rPr>
-        <w:t xml:space="preserve">                    </w:t>
-      </w:r>
-      <w:r>
-        <w:rPr>
-          <w:rFonts w:ascii="Consolas" w:hAnsi="Consolas"/>
-          <w:color w:val="808080"/>
-          <w:sz w:val="21"/>
-          <w:szCs w:val="21"/>
-        </w:rPr>
-        <w:t>&lt;/</w:t>
-      </w:r>
-      <w:r>
-        <w:rPr>
-          <w:rFonts w:ascii="Consolas" w:hAnsi="Consolas"/>
-          <w:color w:val="569CD6"/>
-          <w:sz w:val="21"/>
-          <w:szCs w:val="21"/>
-        </w:rPr>
-        <w:t>li</w:t>
-      </w:r>
-      <w:r>
-        <w:rPr>
-          <w:rFonts w:ascii="Consolas" w:hAnsi="Consolas"/>
-          <w:color w:val="808080"/>
-          <w:sz w:val="21"/>
-          <w:szCs w:val="21"/>
-        </w:rPr>
-        <w:t>&gt;</w:t>
-      </w:r>
-    </w:p>
-    <w:p/>
+        <w:jc w:val="both"/>
+      </w:pPr>
+    </w:p>
     <w:p>
       <w:pPr>
         <w:pStyle w:val="Heading2"/>
+        <w:jc w:val="both"/>
       </w:pPr>
       <w:bookmarkStart w:id="6" w:name="_Toc222413904"/>
       <w:r>
-        <w:t>+layout.svelte</w:t>
+        <w:t>+</w:t>
+      </w:r>
+      <w:proofErr w:type="spellStart"/>
+      <w:r>
+        <w:t>layout.svelte</w:t>
       </w:r>
       <w:bookmarkEnd w:id="6"/>
-    </w:p>
-    <w:p>
+      <w:proofErr w:type="spellEnd"/>
+    </w:p>
+    <w:p>
+      <w:pPr>
+        <w:jc w:val="both"/>
+      </w:pPr>
       <w:r>
         <w:t>Do the following:</w:t>
       </w:r>
@@ -3748,6 +3740,7 @@
           <w:numId w:val="2"/>
         </w:numPr>
         <w:ind w:left="360"/>
+        <w:jc w:val="both"/>
       </w:pPr>
       <w:r>
         <w:t>R</w:t>
@@ -3756,7 +3749,13 @@
         <w:t>emove the header content</w:t>
       </w:r>
       <w:r>
-        <w:t xml:space="preserve"> from this file.</w:t>
+        <w:t xml:space="preserve"> from this file</w:t>
+      </w:r>
+      <w:r>
+        <w:t xml:space="preserve"> (you should have done this already)</w:t>
+      </w:r>
+      <w:r>
+        <w:t>.</w:t>
       </w:r>
     </w:p>
     <w:p>
@@ -3767,6 +3766,7 @@
           <w:numId w:val="2"/>
         </w:numPr>
         <w:ind w:left="360"/>
+        <w:jc w:val="both"/>
       </w:pPr>
       <w:r>
         <w:t>Add the imports for the components you just created</w:t>
@@ -3780,16 +3780,22 @@
           <w:numId w:val="2"/>
         </w:numPr>
         <w:ind w:left="360"/>
+        <w:jc w:val="both"/>
       </w:pPr>
       <w:r>
         <w:t>The add the logic to determine, which menu to display. I have shown the complete file below.</w:t>
       </w:r>
     </w:p>
-    <w:p/>
+    <w:p>
+      <w:pPr>
+        <w:jc w:val="both"/>
+      </w:pPr>
+    </w:p>
     <w:p>
       <w:pPr>
         <w:shd w:val="clear" w:color="auto" w:fill="1F1F1F"/>
         <w:spacing w:line="285" w:lineRule="atLeast"/>
+        <w:jc w:val="both"/>
         <w:rPr>
           <w:rFonts w:ascii="Consolas" w:hAnsi="Consolas"/>
           <w:color w:val="CCCCCC"/>
@@ -3829,6 +3835,7 @@
       <w:pPr>
         <w:shd w:val="clear" w:color="auto" w:fill="1F1F1F"/>
         <w:spacing w:line="285" w:lineRule="atLeast"/>
+        <w:jc w:val="both"/>
         <w:rPr>
           <w:rFonts w:ascii="Consolas" w:hAnsi="Consolas"/>
           <w:color w:val="CCCCCC"/>
@@ -3906,7 +3913,27 @@
           <w:sz w:val="21"/>
           <w:szCs w:val="21"/>
         </w:rPr>
-        <w:t>'$lib/assets/favicon.svg'</w:t>
+        <w:t>'$lib/assets/</w:t>
+      </w:r>
+      <w:proofErr w:type="spellStart"/>
+      <w:r>
+        <w:rPr>
+          <w:rFonts w:ascii="Consolas" w:hAnsi="Consolas"/>
+          <w:color w:val="CE9178"/>
+          <w:sz w:val="21"/>
+          <w:szCs w:val="21"/>
+        </w:rPr>
+        <w:t>favicon.svg</w:t>
+      </w:r>
+      <w:proofErr w:type="spellEnd"/>
+      <w:r>
+        <w:rPr>
+          <w:rFonts w:ascii="Consolas" w:hAnsi="Consolas"/>
+          <w:color w:val="CE9178"/>
+          <w:sz w:val="21"/>
+          <w:szCs w:val="21"/>
+        </w:rPr>
+        <w:t>'</w:t>
       </w:r>
       <w:r>
         <w:rPr>
@@ -3922,6 +3949,7 @@
       <w:pPr>
         <w:shd w:val="clear" w:color="auto" w:fill="1F1F1F"/>
         <w:spacing w:line="285" w:lineRule="atLeast"/>
+        <w:jc w:val="both"/>
         <w:rPr>
           <w:rFonts w:ascii="Consolas" w:hAnsi="Consolas"/>
           <w:color w:val="CCCCCC"/>
@@ -3956,6 +3984,7 @@
         </w:rPr>
         <w:t xml:space="preserve"> </w:t>
       </w:r>
+      <w:proofErr w:type="spellStart"/>
       <w:r>
         <w:rPr>
           <w:rFonts w:ascii="Consolas" w:hAnsi="Consolas"/>
@@ -3965,6 +3994,7 @@
         </w:rPr>
         <w:t>MainMenu</w:t>
       </w:r>
+      <w:proofErr w:type="spellEnd"/>
       <w:r>
         <w:rPr>
           <w:rFonts w:ascii="Consolas" w:hAnsi="Consolas"/>
@@ -3999,7 +4029,27 @@
           <w:sz w:val="21"/>
           <w:szCs w:val="21"/>
         </w:rPr>
-        <w:t>'$lib/components/MainMenu.svelte'</w:t>
+        <w:t>'$lib/components/</w:t>
+      </w:r>
+      <w:proofErr w:type="spellStart"/>
+      <w:r>
+        <w:rPr>
+          <w:rFonts w:ascii="Consolas" w:hAnsi="Consolas"/>
+          <w:color w:val="CE9178"/>
+          <w:sz w:val="21"/>
+          <w:szCs w:val="21"/>
+        </w:rPr>
+        <w:t>MainMenu.svelte</w:t>
+      </w:r>
+      <w:proofErr w:type="spellEnd"/>
+      <w:r>
+        <w:rPr>
+          <w:rFonts w:ascii="Consolas" w:hAnsi="Consolas"/>
+          <w:color w:val="CE9178"/>
+          <w:sz w:val="21"/>
+          <w:szCs w:val="21"/>
+        </w:rPr>
+        <w:t>'</w:t>
       </w:r>
       <w:r>
         <w:rPr>
@@ -4015,6 +4065,7 @@
       <w:pPr>
         <w:shd w:val="clear" w:color="auto" w:fill="1F1F1F"/>
         <w:spacing w:line="285" w:lineRule="atLeast"/>
+        <w:jc w:val="both"/>
         <w:rPr>
           <w:rFonts w:ascii="Consolas" w:hAnsi="Consolas"/>
           <w:color w:val="CCCCCC"/>
@@ -4049,6 +4100,7 @@
         </w:rPr>
         <w:t xml:space="preserve"> </w:t>
       </w:r>
+      <w:proofErr w:type="spellStart"/>
       <w:r>
         <w:rPr>
           <w:rFonts w:ascii="Consolas" w:hAnsi="Consolas"/>
@@ -4058,6 +4110,7 @@
         </w:rPr>
         <w:t>AdminMenu</w:t>
       </w:r>
+      <w:proofErr w:type="spellEnd"/>
       <w:r>
         <w:rPr>
           <w:rFonts w:ascii="Consolas" w:hAnsi="Consolas"/>
@@ -4092,7 +4145,27 @@
           <w:sz w:val="21"/>
           <w:szCs w:val="21"/>
         </w:rPr>
-        <w:t>'$lib/components/AdminMenu.svelte'</w:t>
+        <w:t>'$lib/components/</w:t>
+      </w:r>
+      <w:proofErr w:type="spellStart"/>
+      <w:r>
+        <w:rPr>
+          <w:rFonts w:ascii="Consolas" w:hAnsi="Consolas"/>
+          <w:color w:val="CE9178"/>
+          <w:sz w:val="21"/>
+          <w:szCs w:val="21"/>
+        </w:rPr>
+        <w:t>AdminMenu.svelte</w:t>
+      </w:r>
+      <w:proofErr w:type="spellEnd"/>
+      <w:r>
+        <w:rPr>
+          <w:rFonts w:ascii="Consolas" w:hAnsi="Consolas"/>
+          <w:color w:val="CE9178"/>
+          <w:sz w:val="21"/>
+          <w:szCs w:val="21"/>
+        </w:rPr>
+        <w:t>'</w:t>
       </w:r>
       <w:r>
         <w:rPr>
@@ -4108,6 +4181,7 @@
       <w:pPr>
         <w:shd w:val="clear" w:color="auto" w:fill="1F1F1F"/>
         <w:spacing w:line="285" w:lineRule="atLeast"/>
+        <w:jc w:val="both"/>
         <w:rPr>
           <w:rFonts w:ascii="Consolas" w:hAnsi="Consolas"/>
           <w:color w:val="CCCCCC"/>
@@ -4201,6 +4275,7 @@
       <w:pPr>
         <w:shd w:val="clear" w:color="auto" w:fill="1F1F1F"/>
         <w:spacing w:line="285" w:lineRule="atLeast"/>
+        <w:jc w:val="both"/>
         <w:rPr>
           <w:rFonts w:ascii="Consolas" w:hAnsi="Consolas"/>
           <w:color w:val="CCCCCC"/>
@@ -4213,6 +4288,7 @@
       <w:pPr>
         <w:shd w:val="clear" w:color="auto" w:fill="1F1F1F"/>
         <w:spacing w:line="285" w:lineRule="atLeast"/>
+        <w:jc w:val="both"/>
         <w:rPr>
           <w:rFonts w:ascii="Consolas" w:hAnsi="Consolas"/>
           <w:color w:val="CCCCCC"/>
@@ -4236,13 +4312,34 @@
           <w:sz w:val="21"/>
           <w:szCs w:val="21"/>
         </w:rPr>
-        <w:t>// onMount runs after the component is mounted to the DOM</w:t>
+        <w:t xml:space="preserve">// </w:t>
+      </w:r>
+      <w:proofErr w:type="spellStart"/>
+      <w:r>
+        <w:rPr>
+          <w:rFonts w:ascii="Consolas" w:hAnsi="Consolas"/>
+          <w:color w:val="6A9955"/>
+          <w:sz w:val="21"/>
+          <w:szCs w:val="21"/>
+        </w:rPr>
+        <w:t>onMount</w:t>
+      </w:r>
+      <w:proofErr w:type="spellEnd"/>
+      <w:r>
+        <w:rPr>
+          <w:rFonts w:ascii="Consolas" w:hAnsi="Consolas"/>
+          <w:color w:val="6A9955"/>
+          <w:sz w:val="21"/>
+          <w:szCs w:val="21"/>
+        </w:rPr>
+        <w:t xml:space="preserve"> runs after the component is mounted to the DOM</w:t>
       </w:r>
     </w:p>
     <w:p>
       <w:pPr>
         <w:shd w:val="clear" w:color="auto" w:fill="1F1F1F"/>
         <w:spacing w:line="285" w:lineRule="atLeast"/>
+        <w:jc w:val="both"/>
         <w:rPr>
           <w:rFonts w:ascii="Consolas" w:hAnsi="Consolas"/>
           <w:color w:val="CCCCCC"/>
@@ -4273,6 +4370,7 @@
       <w:pPr>
         <w:shd w:val="clear" w:color="auto" w:fill="1F1F1F"/>
         <w:spacing w:line="285" w:lineRule="atLeast"/>
+        <w:jc w:val="both"/>
         <w:rPr>
           <w:rFonts w:ascii="Consolas" w:hAnsi="Consolas"/>
           <w:color w:val="CCCCCC"/>
@@ -4307,6 +4405,7 @@
         </w:rPr>
         <w:t xml:space="preserve"> { </w:t>
       </w:r>
+      <w:proofErr w:type="spellStart"/>
       <w:r>
         <w:rPr>
           <w:rFonts w:ascii="Consolas" w:hAnsi="Consolas"/>
@@ -4316,6 +4415,7 @@
         </w:rPr>
         <w:t>onMount</w:t>
       </w:r>
+      <w:proofErr w:type="spellEnd"/>
       <w:r>
         <w:rPr>
           <w:rFonts w:ascii="Consolas" w:hAnsi="Consolas"/>
@@ -4366,6 +4466,7 @@
       <w:pPr>
         <w:shd w:val="clear" w:color="auto" w:fill="1F1F1F"/>
         <w:spacing w:line="285" w:lineRule="atLeast"/>
+        <w:jc w:val="both"/>
         <w:rPr>
           <w:rFonts w:ascii="Consolas" w:hAnsi="Consolas"/>
           <w:color w:val="CCCCCC"/>
@@ -4378,6 +4479,7 @@
       <w:pPr>
         <w:shd w:val="clear" w:color="auto" w:fill="1F1F1F"/>
         <w:spacing w:line="285" w:lineRule="atLeast"/>
+        <w:jc w:val="both"/>
         <w:rPr>
           <w:rFonts w:ascii="Consolas" w:hAnsi="Consolas"/>
           <w:color w:val="CCCCCC"/>
@@ -4392,7 +4494,6 @@
           <w:sz w:val="21"/>
           <w:szCs w:val="21"/>
         </w:rPr>
-        <w:lastRenderedPageBreak/>
         <w:t xml:space="preserve">    </w:t>
       </w:r>
       <w:r>
@@ -4409,6 +4510,7 @@
       <w:pPr>
         <w:shd w:val="clear" w:color="auto" w:fill="1F1F1F"/>
         <w:spacing w:line="285" w:lineRule="atLeast"/>
+        <w:jc w:val="both"/>
         <w:rPr>
           <w:rFonts w:ascii="Consolas" w:hAnsi="Consolas"/>
           <w:color w:val="CCCCCC"/>
@@ -4502,6 +4604,7 @@
       <w:pPr>
         <w:shd w:val="clear" w:color="auto" w:fill="1F1F1F"/>
         <w:spacing w:line="285" w:lineRule="atLeast"/>
+        <w:jc w:val="both"/>
         <w:rPr>
           <w:rFonts w:ascii="Consolas" w:hAnsi="Consolas"/>
           <w:color w:val="CCCCCC"/>
@@ -4543,13 +4646,54 @@
           <w:sz w:val="21"/>
           <w:szCs w:val="21"/>
         </w:rPr>
-        <w:t>'bootstrap/dist/css/bootstrap.min.css'</w:t>
+        <w:t>'bootstrap/</w:t>
+      </w:r>
+      <w:proofErr w:type="spellStart"/>
+      <w:r>
+        <w:rPr>
+          <w:rFonts w:ascii="Consolas" w:hAnsi="Consolas"/>
+          <w:color w:val="CE9178"/>
+          <w:sz w:val="21"/>
+          <w:szCs w:val="21"/>
+        </w:rPr>
+        <w:t>dist</w:t>
+      </w:r>
+      <w:proofErr w:type="spellEnd"/>
+      <w:r>
+        <w:rPr>
+          <w:rFonts w:ascii="Consolas" w:hAnsi="Consolas"/>
+          <w:color w:val="CE9178"/>
+          <w:sz w:val="21"/>
+          <w:szCs w:val="21"/>
+        </w:rPr>
+        <w:t>/</w:t>
+      </w:r>
+      <w:proofErr w:type="spellStart"/>
+      <w:r>
+        <w:rPr>
+          <w:rFonts w:ascii="Consolas" w:hAnsi="Consolas"/>
+          <w:color w:val="CE9178"/>
+          <w:sz w:val="21"/>
+          <w:szCs w:val="21"/>
+        </w:rPr>
+        <w:t>css</w:t>
+      </w:r>
+      <w:proofErr w:type="spellEnd"/>
+      <w:r>
+        <w:rPr>
+          <w:rFonts w:ascii="Consolas" w:hAnsi="Consolas"/>
+          <w:color w:val="CE9178"/>
+          <w:sz w:val="21"/>
+          <w:szCs w:val="21"/>
+        </w:rPr>
+        <w:t>/bootstrap.min.css'</w:t>
       </w:r>
     </w:p>
     <w:p>
       <w:pPr>
         <w:shd w:val="clear" w:color="auto" w:fill="1F1F1F"/>
         <w:spacing w:line="285" w:lineRule="atLeast"/>
+        <w:jc w:val="both"/>
         <w:rPr>
           <w:rFonts w:ascii="Consolas" w:hAnsi="Consolas"/>
           <w:color w:val="CCCCCC"/>
@@ -4607,6 +4751,7 @@
       <w:pPr>
         <w:shd w:val="clear" w:color="auto" w:fill="1F1F1F"/>
         <w:spacing w:line="285" w:lineRule="atLeast"/>
+        <w:jc w:val="both"/>
         <w:rPr>
           <w:rFonts w:ascii="Consolas" w:hAnsi="Consolas"/>
           <w:color w:val="CCCCCC"/>
@@ -4619,6 +4764,7 @@
       <w:pPr>
         <w:shd w:val="clear" w:color="auto" w:fill="1F1F1F"/>
         <w:spacing w:line="285" w:lineRule="atLeast"/>
+        <w:jc w:val="both"/>
         <w:rPr>
           <w:rFonts w:ascii="Consolas" w:hAnsi="Consolas"/>
           <w:color w:val="CCCCCC"/>
@@ -4635,6 +4781,7 @@
         </w:rPr>
         <w:t xml:space="preserve">    </w:t>
       </w:r>
+      <w:proofErr w:type="spellStart"/>
       <w:r>
         <w:rPr>
           <w:rFonts w:ascii="Consolas" w:hAnsi="Consolas"/>
@@ -4644,6 +4791,7 @@
         </w:rPr>
         <w:t>onMount</w:t>
       </w:r>
+      <w:proofErr w:type="spellEnd"/>
       <w:r>
         <w:rPr>
           <w:rFonts w:ascii="Consolas" w:hAnsi="Consolas"/>
@@ -4694,6 +4842,7 @@
       <w:pPr>
         <w:shd w:val="clear" w:color="auto" w:fill="1F1F1F"/>
         <w:spacing w:line="285" w:lineRule="atLeast"/>
+        <w:jc w:val="both"/>
         <w:rPr>
           <w:rFonts w:ascii="Consolas" w:hAnsi="Consolas"/>
           <w:color w:val="CCCCCC"/>
@@ -4751,6 +4900,7 @@
       <w:pPr>
         <w:shd w:val="clear" w:color="auto" w:fill="1F1F1F"/>
         <w:spacing w:line="285" w:lineRule="atLeast"/>
+        <w:jc w:val="both"/>
         <w:rPr>
           <w:rFonts w:ascii="Consolas" w:hAnsi="Consolas"/>
           <w:color w:val="CCCCCC"/>
@@ -4781,6 +4931,7 @@
       <w:pPr>
         <w:shd w:val="clear" w:color="auto" w:fill="1F1F1F"/>
         <w:spacing w:line="285" w:lineRule="atLeast"/>
+        <w:jc w:val="both"/>
         <w:rPr>
           <w:rFonts w:ascii="Consolas" w:hAnsi="Consolas"/>
           <w:color w:val="CCCCCC"/>
@@ -4856,6 +5007,7 @@
       <w:pPr>
         <w:shd w:val="clear" w:color="auto" w:fill="1F1F1F"/>
         <w:spacing w:line="285" w:lineRule="atLeast"/>
+        <w:jc w:val="both"/>
         <w:rPr>
           <w:rFonts w:ascii="Consolas" w:hAnsi="Consolas"/>
           <w:color w:val="CCCCCC"/>
@@ -4931,6 +5083,7 @@
       <w:pPr>
         <w:shd w:val="clear" w:color="auto" w:fill="1F1F1F"/>
         <w:spacing w:line="285" w:lineRule="atLeast"/>
+        <w:jc w:val="both"/>
         <w:rPr>
           <w:rFonts w:ascii="Consolas" w:hAnsi="Consolas"/>
           <w:color w:val="CCCCCC"/>
@@ -4952,6 +5105,7 @@
       <w:pPr>
         <w:shd w:val="clear" w:color="auto" w:fill="1F1F1F"/>
         <w:spacing w:line="285" w:lineRule="atLeast"/>
+        <w:jc w:val="both"/>
         <w:rPr>
           <w:rFonts w:ascii="Consolas" w:hAnsi="Consolas"/>
           <w:color w:val="CCCCCC"/>
@@ -4973,6 +5127,7 @@
       <w:pPr>
         <w:shd w:val="clear" w:color="auto" w:fill="1F1F1F"/>
         <w:spacing w:line="285" w:lineRule="atLeast"/>
+        <w:jc w:val="both"/>
         <w:rPr>
           <w:rFonts w:ascii="Consolas" w:hAnsi="Consolas"/>
           <w:color w:val="CCCCCC"/>
@@ -4985,6 +5140,7 @@
       <w:pPr>
         <w:shd w:val="clear" w:color="auto" w:fill="1F1F1F"/>
         <w:spacing w:line="285" w:lineRule="atLeast"/>
+        <w:jc w:val="both"/>
         <w:rPr>
           <w:rFonts w:ascii="Consolas" w:hAnsi="Consolas"/>
           <w:color w:val="CCCCCC"/>
@@ -5078,6 +5234,7 @@
       <w:pPr>
         <w:shd w:val="clear" w:color="auto" w:fill="1F1F1F"/>
         <w:spacing w:line="285" w:lineRule="atLeast"/>
+        <w:jc w:val="both"/>
         <w:rPr>
           <w:rFonts w:ascii="Consolas" w:hAnsi="Consolas"/>
           <w:color w:val="CCCCCC"/>
@@ -5117,6 +5274,7 @@
       <w:pPr>
         <w:shd w:val="clear" w:color="auto" w:fill="1F1F1F"/>
         <w:spacing w:line="285" w:lineRule="atLeast"/>
+        <w:jc w:val="both"/>
         <w:rPr>
           <w:rFonts w:ascii="Consolas" w:hAnsi="Consolas"/>
           <w:color w:val="CCCCCC"/>
@@ -5129,6 +5287,7 @@
       <w:pPr>
         <w:shd w:val="clear" w:color="auto" w:fill="1F1F1F"/>
         <w:spacing w:line="285" w:lineRule="atLeast"/>
+        <w:jc w:val="both"/>
         <w:rPr>
           <w:rFonts w:ascii="Consolas" w:hAnsi="Consolas"/>
           <w:color w:val="CCCCCC"/>
@@ -5145,6 +5304,7 @@
         </w:rPr>
         <w:t>&lt;</w:t>
       </w:r>
+      <w:proofErr w:type="spellStart"/>
       <w:r>
         <w:rPr>
           <w:rFonts w:ascii="Consolas" w:hAnsi="Consolas"/>
@@ -5172,6 +5332,7 @@
         </w:rPr>
         <w:t>head</w:t>
       </w:r>
+      <w:proofErr w:type="spellEnd"/>
       <w:r>
         <w:rPr>
           <w:rFonts w:ascii="Consolas" w:hAnsi="Consolas"/>
@@ -5186,6 +5347,7 @@
       <w:pPr>
         <w:shd w:val="clear" w:color="auto" w:fill="1F1F1F"/>
         <w:spacing w:line="285" w:lineRule="atLeast"/>
+        <w:jc w:val="both"/>
         <w:rPr>
           <w:rFonts w:ascii="Consolas" w:hAnsi="Consolas"/>
           <w:color w:val="CCCCCC"/>
@@ -5270,6 +5432,7 @@
       <w:pPr>
         <w:shd w:val="clear" w:color="auto" w:fill="1F1F1F"/>
         <w:spacing w:line="285" w:lineRule="atLeast"/>
+        <w:jc w:val="both"/>
         <w:rPr>
           <w:rFonts w:ascii="Consolas" w:hAnsi="Consolas"/>
           <w:color w:val="CCCCCC"/>
@@ -5286,6 +5449,7 @@
         </w:rPr>
         <w:t>&lt;/</w:t>
       </w:r>
+      <w:proofErr w:type="spellStart"/>
       <w:r>
         <w:rPr>
           <w:rFonts w:ascii="Consolas" w:hAnsi="Consolas"/>
@@ -5313,6 +5477,7 @@
         </w:rPr>
         <w:t>head</w:t>
       </w:r>
+      <w:proofErr w:type="spellEnd"/>
       <w:r>
         <w:rPr>
           <w:rFonts w:ascii="Consolas" w:hAnsi="Consolas"/>
@@ -5327,6 +5492,7 @@
       <w:pPr>
         <w:shd w:val="clear" w:color="auto" w:fill="1F1F1F"/>
         <w:spacing w:line="285" w:lineRule="atLeast"/>
+        <w:jc w:val="both"/>
         <w:rPr>
           <w:rFonts w:ascii="Consolas" w:hAnsi="Consolas"/>
           <w:color w:val="CCCCCC"/>
@@ -5348,6 +5514,7 @@
       <w:pPr>
         <w:shd w:val="clear" w:color="auto" w:fill="1F1F1F"/>
         <w:spacing w:line="285" w:lineRule="atLeast"/>
+        <w:jc w:val="both"/>
         <w:rPr>
           <w:rFonts w:ascii="Consolas" w:hAnsi="Consolas"/>
           <w:color w:val="CCCCCC"/>
@@ -5382,6 +5549,7 @@
         </w:rPr>
         <w:t xml:space="preserve"> </w:t>
       </w:r>
+      <w:proofErr w:type="spellStart"/>
       <w:r>
         <w:rPr>
           <w:rFonts w:ascii="Consolas" w:hAnsi="Consolas"/>
@@ -5409,6 +5577,7 @@
         </w:rPr>
         <w:t>user</w:t>
       </w:r>
+      <w:proofErr w:type="spellEnd"/>
       <w:r>
         <w:rPr>
           <w:rFonts w:ascii="Consolas" w:hAnsi="Consolas"/>
@@ -5416,8 +5585,9 @@
           <w:sz w:val="21"/>
           <w:szCs w:val="21"/>
         </w:rPr>
-        <w:t xml:space="preserve"> &amp;&amp; </w:t>
-      </w:r>
+        <w:t xml:space="preserve"> &amp;&amp; (</w:t>
+      </w:r>
+      <w:proofErr w:type="spellStart"/>
       <w:r>
         <w:rPr>
           <w:rFonts w:ascii="Consolas" w:hAnsi="Consolas"/>
@@ -5463,6 +5633,7 @@
         </w:rPr>
         <w:t>role</w:t>
       </w:r>
+      <w:proofErr w:type="spellEnd"/>
       <w:r>
         <w:rPr>
           <w:rFonts w:ascii="Consolas" w:hAnsi="Consolas"/>
@@ -5498,6 +5669,15 @@
           <w:szCs w:val="21"/>
         </w:rPr>
         <w:t>ADMIN</w:t>
+      </w:r>
+      <w:r>
+        <w:rPr>
+          <w:rFonts w:ascii="Consolas" w:hAnsi="Consolas"/>
+          <w:color w:val="D4D4D4"/>
+          <w:sz w:val="21"/>
+          <w:szCs w:val="21"/>
+        </w:rPr>
+        <w:t>)</w:t>
       </w:r>
       <w:r>
         <w:rPr>
@@ -5513,6 +5693,7 @@
       <w:pPr>
         <w:shd w:val="clear" w:color="auto" w:fill="1F1F1F"/>
         <w:spacing w:line="285" w:lineRule="atLeast"/>
+        <w:jc w:val="both"/>
         <w:rPr>
           <w:rFonts w:ascii="Consolas" w:hAnsi="Consolas"/>
           <w:color w:val="CCCCCC"/>
@@ -5538,6 +5719,7 @@
         </w:rPr>
         <w:t>&lt;</w:t>
       </w:r>
+      <w:proofErr w:type="spellStart"/>
       <w:r>
         <w:rPr>
           <w:rFonts w:ascii="Consolas" w:hAnsi="Consolas"/>
@@ -5547,6 +5729,7 @@
         </w:rPr>
         <w:t>AdminMenu</w:t>
       </w:r>
+      <w:proofErr w:type="spellEnd"/>
       <w:r>
         <w:rPr>
           <w:rFonts w:ascii="Consolas" w:hAnsi="Consolas"/>
@@ -5588,6 +5771,7 @@
       <w:pPr>
         <w:shd w:val="clear" w:color="auto" w:fill="1F1F1F"/>
         <w:spacing w:line="285" w:lineRule="atLeast"/>
+        <w:jc w:val="both"/>
         <w:rPr>
           <w:rFonts w:ascii="Consolas" w:hAnsi="Consolas"/>
           <w:color w:val="CCCCCC"/>
@@ -5627,6 +5811,7 @@
       <w:pPr>
         <w:shd w:val="clear" w:color="auto" w:fill="1F1F1F"/>
         <w:spacing w:line="285" w:lineRule="atLeast"/>
+        <w:jc w:val="both"/>
         <w:rPr>
           <w:rFonts w:ascii="Consolas" w:hAnsi="Consolas"/>
           <w:color w:val="CCCCCC"/>
@@ -5652,6 +5837,7 @@
         </w:rPr>
         <w:t>&lt;</w:t>
       </w:r>
+      <w:proofErr w:type="spellStart"/>
       <w:r>
         <w:rPr>
           <w:rFonts w:ascii="Consolas" w:hAnsi="Consolas"/>
@@ -5661,6 +5847,7 @@
         </w:rPr>
         <w:t>MainMenu</w:t>
       </w:r>
+      <w:proofErr w:type="spellEnd"/>
       <w:r>
         <w:rPr>
           <w:rFonts w:ascii="Consolas" w:hAnsi="Consolas"/>
@@ -5702,6 +5889,7 @@
       <w:pPr>
         <w:shd w:val="clear" w:color="auto" w:fill="1F1F1F"/>
         <w:spacing w:line="285" w:lineRule="atLeast"/>
+        <w:jc w:val="both"/>
         <w:rPr>
           <w:rFonts w:ascii="Consolas" w:hAnsi="Consolas"/>
           <w:color w:val="CCCCCC"/>
@@ -5741,6 +5929,7 @@
       <w:pPr>
         <w:shd w:val="clear" w:color="auto" w:fill="1F1F1F"/>
         <w:spacing w:line="285" w:lineRule="atLeast"/>
+        <w:jc w:val="both"/>
         <w:rPr>
           <w:rFonts w:ascii="Consolas" w:hAnsi="Consolas"/>
           <w:color w:val="CCCCCC"/>
@@ -5753,6 +5942,7 @@
       <w:pPr>
         <w:shd w:val="clear" w:color="auto" w:fill="1F1F1F"/>
         <w:spacing w:line="285" w:lineRule="atLeast"/>
+        <w:jc w:val="both"/>
         <w:rPr>
           <w:rFonts w:ascii="Consolas" w:hAnsi="Consolas"/>
           <w:color w:val="CCCCCC"/>
@@ -5828,6 +6018,7 @@
       <w:pPr>
         <w:shd w:val="clear" w:color="auto" w:fill="1F1F1F"/>
         <w:spacing w:line="285" w:lineRule="atLeast"/>
+        <w:jc w:val="both"/>
         <w:rPr>
           <w:rFonts w:ascii="Consolas" w:hAnsi="Consolas"/>
           <w:color w:val="CCCCCC"/>
@@ -5894,6 +6085,7 @@
       <w:pPr>
         <w:shd w:val="clear" w:color="auto" w:fill="1F1F1F"/>
         <w:spacing w:line="285" w:lineRule="atLeast"/>
+        <w:jc w:val="both"/>
         <w:rPr>
           <w:rFonts w:ascii="Consolas" w:hAnsi="Consolas"/>
           <w:color w:val="CCCCCC"/>
@@ -5929,16 +6121,71 @@
         <w:t>&gt;</w:t>
       </w:r>
     </w:p>
-    <w:p/>
+    <w:p>
+      <w:pPr>
+        <w:jc w:val="both"/>
+      </w:pPr>
+    </w:p>
     <w:p>
       <w:pPr>
         <w:pStyle w:val="Heading2"/>
-      </w:pPr>
-      <w:r>
-        <w:t>Create +page.svelte</w:t>
-      </w:r>
-    </w:p>
-    <w:p>
+        <w:jc w:val="both"/>
+      </w:pPr>
+      <w:r>
+        <w:t xml:space="preserve">Create </w:t>
+      </w:r>
+      <w:r>
+        <w:t>an Admin home page admin/</w:t>
+      </w:r>
+      <w:r>
+        <w:t>+</w:t>
+      </w:r>
+      <w:proofErr w:type="spellStart"/>
+      <w:r>
+        <w:t>page.svelte</w:t>
+      </w:r>
+      <w:proofErr w:type="spellEnd"/>
+    </w:p>
+    <w:p>
+      <w:pPr>
+        <w:jc w:val="both"/>
+      </w:pPr>
+      <w:r>
+        <w:t xml:space="preserve">Create a new folder </w:t>
+      </w:r>
+      <w:r>
+        <w:rPr>
+          <w:b/>
+          <w:bCs/>
+        </w:rPr>
+        <w:t>routes/admin</w:t>
+      </w:r>
+      <w:r>
+        <w:t>. Not in (protected) or (public), just routes/.</w:t>
+      </w:r>
+      <w:r>
+        <w:br/>
+        <w:t xml:space="preserve">Create a new file </w:t>
+      </w:r>
+      <w:r>
+        <w:rPr>
+          <w:b/>
+          <w:bCs/>
+        </w:rPr>
+        <w:t>+</w:t>
+      </w:r>
+      <w:proofErr w:type="spellStart"/>
+      <w:r>
+        <w:rPr>
+          <w:b/>
+          <w:bCs/>
+        </w:rPr>
+        <w:t>page.svelte</w:t>
+      </w:r>
+      <w:proofErr w:type="spellEnd"/>
+      <w:r>
+        <w:t xml:space="preserve">. </w:t>
+      </w:r>
       <w:r>
         <w:t>This is the admin home page. You can add what you want here. To get started I just have the following.</w:t>
       </w:r>
@@ -5947,6 +6194,7 @@
       <w:pPr>
         <w:shd w:val="clear" w:color="auto" w:fill="1F1F1F"/>
         <w:spacing w:line="285" w:lineRule="atLeast"/>
+        <w:jc w:val="both"/>
         <w:rPr>
           <w:rFonts w:ascii="Consolas" w:hAnsi="Consolas"/>
           <w:color w:val="CCCCCC"/>
@@ -6022,6 +6270,7 @@
       <w:pPr>
         <w:shd w:val="clear" w:color="auto" w:fill="1F1F1F"/>
         <w:spacing w:line="285" w:lineRule="atLeast"/>
+        <w:jc w:val="both"/>
         <w:rPr>
           <w:rFonts w:ascii="Consolas" w:hAnsi="Consolas"/>
           <w:color w:val="CCCCCC"/>
@@ -6093,16 +6342,30 @@
         <w:t>&gt;</w:t>
       </w:r>
     </w:p>
-    <w:p/>
+    <w:p>
+      <w:pPr>
+        <w:jc w:val="both"/>
+      </w:pPr>
+    </w:p>
     <w:p>
       <w:pPr>
         <w:pStyle w:val="Heading2"/>
-      </w:pPr>
-      <w:r>
-        <w:t>Create +layout.server.js</w:t>
-      </w:r>
-    </w:p>
-    <w:p>
+        <w:jc w:val="both"/>
+      </w:pPr>
+      <w:r>
+        <w:t xml:space="preserve">Create </w:t>
+      </w:r>
+      <w:r>
+        <w:t>admin/</w:t>
+      </w:r>
+      <w:r>
+        <w:t>+layout.server.js</w:t>
+      </w:r>
+    </w:p>
+    <w:p>
+      <w:pPr>
+        <w:jc w:val="both"/>
+      </w:pPr>
       <w:r>
         <w:t xml:space="preserve">To ensure that only admins have access to the folder, we </w:t>
       </w:r>
@@ -6110,7 +6373,21 @@
         <w:t>need to ensure the user is logged in and is the admin. We did something very similar for the protected folder.</w:t>
       </w:r>
     </w:p>
-    <w:p/>
+    <w:p>
+      <w:pPr>
+        <w:jc w:val="both"/>
+      </w:pPr>
+      <w:r>
+        <w:t xml:space="preserve">Create a new file </w:t>
+      </w:r>
+      <w:r>
+        <w:rPr>
+          <w:b/>
+          <w:bCs/>
+        </w:rPr>
+        <w:t>admin/+layout.server.js</w:t>
+      </w:r>
+    </w:p>
     <w:p>
       <w:pPr>
         <w:shd w:val="clear" w:color="auto" w:fill="1F1F1F"/>
@@ -6129,7 +6406,27 @@
           <w:sz w:val="21"/>
           <w:szCs w:val="21"/>
         </w:rPr>
-        <w:t>// src/routes/admin/+layout.server.ts</w:t>
+        <w:t xml:space="preserve">// </w:t>
+      </w:r>
+      <w:proofErr w:type="spellStart"/>
+      <w:r>
+        <w:rPr>
+          <w:rFonts w:ascii="Consolas" w:hAnsi="Consolas"/>
+          <w:color w:val="6A9955"/>
+          <w:sz w:val="21"/>
+          <w:szCs w:val="21"/>
+        </w:rPr>
+        <w:t>src</w:t>
+      </w:r>
+      <w:proofErr w:type="spellEnd"/>
+      <w:r>
+        <w:rPr>
+          <w:rFonts w:ascii="Consolas" w:hAnsi="Consolas"/>
+          <w:color w:val="6A9955"/>
+          <w:sz w:val="21"/>
+          <w:szCs w:val="21"/>
+        </w:rPr>
+        <w:t>/routes/admin/+layout.server.js</w:t>
       </w:r>
     </w:p>
     <w:p>
@@ -6222,7 +6519,27 @@
           <w:sz w:val="21"/>
           <w:szCs w:val="21"/>
         </w:rPr>
-        <w:t>"@sveltejs/kit"</w:t>
+        <w:t>"@</w:t>
+      </w:r>
+      <w:proofErr w:type="spellStart"/>
+      <w:r>
+        <w:rPr>
+          <w:rFonts w:ascii="Consolas" w:hAnsi="Consolas"/>
+          <w:color w:val="CE9178"/>
+          <w:sz w:val="21"/>
+          <w:szCs w:val="21"/>
+        </w:rPr>
+        <w:t>sveltejs</w:t>
+      </w:r>
+      <w:proofErr w:type="spellEnd"/>
+      <w:r>
+        <w:rPr>
+          <w:rFonts w:ascii="Consolas" w:hAnsi="Consolas"/>
+          <w:color w:val="CE9178"/>
+          <w:sz w:val="21"/>
+          <w:szCs w:val="21"/>
+        </w:rPr>
+        <w:t>/kit"</w:t>
       </w:r>
       <w:r>
         <w:rPr>
@@ -6263,6 +6580,7 @@
         </w:rPr>
         <w:t xml:space="preserve"> { </w:t>
       </w:r>
+      <w:proofErr w:type="spellStart"/>
       <w:r>
         <w:rPr>
           <w:rFonts w:ascii="Consolas" w:hAnsi="Consolas"/>
@@ -6270,8 +6588,9 @@
           <w:sz w:val="21"/>
           <w:szCs w:val="21"/>
         </w:rPr>
-        <w:t>redirect</w:t>
-      </w:r>
+        <w:t>usersService</w:t>
+      </w:r>
+      <w:proofErr w:type="spellEnd"/>
       <w:r>
         <w:rPr>
           <w:rFonts w:ascii="Consolas" w:hAnsi="Consolas"/>
@@ -6306,7 +6625,7 @@
           <w:sz w:val="21"/>
           <w:szCs w:val="21"/>
         </w:rPr>
-        <w:t>'@sveltejs/kit'</w:t>
+        <w:t>'$lib/server/services/users-service.js'</w:t>
       </w:r>
       <w:r>
         <w:rPr>
@@ -6530,6 +6849,7 @@
         </w:rPr>
         <w:t>!</w:t>
       </w:r>
+      <w:proofErr w:type="spellStart"/>
       <w:r>
         <w:rPr>
           <w:rFonts w:ascii="Consolas" w:hAnsi="Consolas"/>
@@ -6557,6 +6877,7 @@
         </w:rPr>
         <w:t>user</w:t>
       </w:r>
+      <w:proofErr w:type="spellEnd"/>
       <w:r>
         <w:rPr>
           <w:rFonts w:ascii="Consolas" w:hAnsi="Consolas"/>
@@ -6585,7 +6906,6 @@
           <w:sz w:val="21"/>
           <w:szCs w:val="21"/>
         </w:rPr>
-        <w:lastRenderedPageBreak/>
         <w:t xml:space="preserve">    </w:t>
       </w:r>
       <w:r>
@@ -6721,7 +7041,7 @@
           <w:sz w:val="21"/>
           <w:szCs w:val="21"/>
         </w:rPr>
-        <w:t>// Layer 2: Check if admin role</w:t>
+        <w:t>// Get user details</w:t>
       </w:r>
     </w:p>
     <w:p>
@@ -6742,8 +7062,67 @@
           <w:sz w:val="21"/>
           <w:szCs w:val="21"/>
         </w:rPr>
+        <w:lastRenderedPageBreak/>
         <w:t xml:space="preserve">  </w:t>
       </w:r>
+      <w:proofErr w:type="spellStart"/>
+      <w:r>
+        <w:rPr>
+          <w:rFonts w:ascii="Consolas" w:hAnsi="Consolas"/>
+          <w:color w:val="569CD6"/>
+          <w:sz w:val="21"/>
+          <w:szCs w:val="21"/>
+        </w:rPr>
+        <w:t>const</w:t>
+      </w:r>
+      <w:proofErr w:type="spellEnd"/>
+      <w:r>
+        <w:rPr>
+          <w:rFonts w:ascii="Consolas" w:hAnsi="Consolas"/>
+          <w:color w:val="CCCCCC"/>
+          <w:sz w:val="21"/>
+          <w:szCs w:val="21"/>
+        </w:rPr>
+        <w:t xml:space="preserve"> </w:t>
+      </w:r>
+      <w:proofErr w:type="spellStart"/>
+      <w:r>
+        <w:rPr>
+          <w:rFonts w:ascii="Consolas" w:hAnsi="Consolas"/>
+          <w:color w:val="4FC1FF"/>
+          <w:sz w:val="21"/>
+          <w:szCs w:val="21"/>
+        </w:rPr>
+        <w:t>fullUser</w:t>
+      </w:r>
+      <w:proofErr w:type="spellEnd"/>
+      <w:r>
+        <w:rPr>
+          <w:rFonts w:ascii="Consolas" w:hAnsi="Consolas"/>
+          <w:color w:val="CCCCCC"/>
+          <w:sz w:val="21"/>
+          <w:szCs w:val="21"/>
+        </w:rPr>
+        <w:t xml:space="preserve"> </w:t>
+      </w:r>
+      <w:r>
+        <w:rPr>
+          <w:rFonts w:ascii="Consolas" w:hAnsi="Consolas"/>
+          <w:color w:val="D4D4D4"/>
+          <w:sz w:val="21"/>
+          <w:szCs w:val="21"/>
+        </w:rPr>
+        <w:t>=</w:t>
+      </w:r>
+      <w:r>
+        <w:rPr>
+          <w:rFonts w:ascii="Consolas" w:hAnsi="Consolas"/>
+          <w:color w:val="CCCCCC"/>
+          <w:sz w:val="21"/>
+          <w:szCs w:val="21"/>
+        </w:rPr>
+        <w:t xml:space="preserve"> </w:t>
+      </w:r>
       <w:r>
         <w:rPr>
           <w:rFonts w:ascii="Consolas" w:hAnsi="Consolas"/>
@@ -6751,16 +7130,72 @@
           <w:sz w:val="21"/>
           <w:szCs w:val="21"/>
         </w:rPr>
-        <w:t>if</w:t>
-      </w:r>
-      <w:r>
-        <w:rPr>
-          <w:rFonts w:ascii="Consolas" w:hAnsi="Consolas"/>
-          <w:color w:val="CCCCCC"/>
-          <w:sz w:val="21"/>
-          <w:szCs w:val="21"/>
-        </w:rPr>
-        <w:t xml:space="preserve"> (</w:t>
+        <w:t>await</w:t>
+      </w:r>
+      <w:r>
+        <w:rPr>
+          <w:rFonts w:ascii="Consolas" w:hAnsi="Consolas"/>
+          <w:color w:val="CCCCCC"/>
+          <w:sz w:val="21"/>
+          <w:szCs w:val="21"/>
+        </w:rPr>
+        <w:t xml:space="preserve"> </w:t>
+      </w:r>
+      <w:proofErr w:type="spellStart"/>
+      <w:r>
+        <w:rPr>
+          <w:rFonts w:ascii="Consolas" w:hAnsi="Consolas"/>
+          <w:color w:val="4FC1FF"/>
+          <w:sz w:val="21"/>
+          <w:szCs w:val="21"/>
+        </w:rPr>
+        <w:t>usersService</w:t>
+      </w:r>
+      <w:r>
+        <w:rPr>
+          <w:rFonts w:ascii="Consolas" w:hAnsi="Consolas"/>
+          <w:color w:val="CCCCCC"/>
+          <w:sz w:val="21"/>
+          <w:szCs w:val="21"/>
+        </w:rPr>
+        <w:t>.</w:t>
+      </w:r>
+      <w:r>
+        <w:rPr>
+          <w:rFonts w:ascii="Consolas" w:hAnsi="Consolas"/>
+          <w:color w:val="DCDCAA"/>
+          <w:sz w:val="21"/>
+          <w:szCs w:val="21"/>
+        </w:rPr>
+        <w:t>getById</w:t>
+      </w:r>
+      <w:proofErr w:type="spellEnd"/>
+      <w:r>
+        <w:rPr>
+          <w:rFonts w:ascii="Consolas" w:hAnsi="Consolas"/>
+          <w:color w:val="CCCCCC"/>
+          <w:sz w:val="21"/>
+          <w:szCs w:val="21"/>
+        </w:rPr>
+        <w:t>(</w:t>
+      </w:r>
+      <w:r>
+        <w:rPr>
+          <w:rFonts w:ascii="Consolas" w:hAnsi="Consolas"/>
+          <w:color w:val="4EC9B0"/>
+          <w:sz w:val="21"/>
+          <w:szCs w:val="21"/>
+        </w:rPr>
+        <w:t>Number</w:t>
+      </w:r>
+      <w:r>
+        <w:rPr>
+          <w:rFonts w:ascii="Consolas" w:hAnsi="Consolas"/>
+          <w:color w:val="CCCCCC"/>
+          <w:sz w:val="21"/>
+          <w:szCs w:val="21"/>
+        </w:rPr>
+        <w:t>(</w:t>
       </w:r>
       <w:r>
         <w:rPr>
@@ -6805,52 +7240,16 @@
           <w:sz w:val="21"/>
           <w:szCs w:val="21"/>
         </w:rPr>
-        <w:t>role</w:t>
-      </w:r>
-      <w:r>
-        <w:rPr>
-          <w:rFonts w:ascii="Consolas" w:hAnsi="Consolas"/>
-          <w:color w:val="CCCCCC"/>
-          <w:sz w:val="21"/>
-          <w:szCs w:val="21"/>
-        </w:rPr>
-        <w:t xml:space="preserve"> </w:t>
-      </w:r>
-      <w:r>
-        <w:rPr>
-          <w:rFonts w:ascii="Consolas" w:hAnsi="Consolas"/>
-          <w:color w:val="D4D4D4"/>
-          <w:sz w:val="21"/>
-          <w:szCs w:val="21"/>
-        </w:rPr>
-        <w:t>!==</w:t>
-      </w:r>
-      <w:r>
-        <w:rPr>
-          <w:rFonts w:ascii="Consolas" w:hAnsi="Consolas"/>
-          <w:color w:val="CCCCCC"/>
-          <w:sz w:val="21"/>
-          <w:szCs w:val="21"/>
-        </w:rPr>
-        <w:t xml:space="preserve"> </w:t>
-      </w:r>
-      <w:r>
-        <w:rPr>
-          <w:rFonts w:ascii="Consolas" w:hAnsi="Consolas"/>
-          <w:color w:val="CE9178"/>
-          <w:sz w:val="21"/>
-          <w:szCs w:val="21"/>
-        </w:rPr>
-        <w:t>'admin'</w:t>
-      </w:r>
-      <w:r>
-        <w:rPr>
-          <w:rFonts w:ascii="Consolas" w:hAnsi="Consolas"/>
-          <w:color w:val="CCCCCC"/>
-          <w:sz w:val="21"/>
-          <w:szCs w:val="21"/>
-        </w:rPr>
-        <w:t>) {</w:t>
+        <w:t>id</w:t>
+      </w:r>
+      <w:r>
+        <w:rPr>
+          <w:rFonts w:ascii="Consolas" w:hAnsi="Consolas"/>
+          <w:color w:val="CCCCCC"/>
+          <w:sz w:val="21"/>
+          <w:szCs w:val="21"/>
+        </w:rPr>
+        <w:t>));</w:t>
       </w:r>
     </w:p>
     <w:p>
@@ -6864,87 +7263,6 @@
           <w:szCs w:val="21"/>
         </w:rPr>
       </w:pPr>
-      <w:r>
-        <w:rPr>
-          <w:rFonts w:ascii="Consolas" w:hAnsi="Consolas"/>
-          <w:color w:val="CCCCCC"/>
-          <w:sz w:val="21"/>
-          <w:szCs w:val="21"/>
-        </w:rPr>
-        <w:t xml:space="preserve">    </w:t>
-      </w:r>
-      <w:r>
-        <w:rPr>
-          <w:rFonts w:ascii="Consolas" w:hAnsi="Consolas"/>
-          <w:color w:val="C586C0"/>
-          <w:sz w:val="21"/>
-          <w:szCs w:val="21"/>
-        </w:rPr>
-        <w:t>throw</w:t>
-      </w:r>
-      <w:r>
-        <w:rPr>
-          <w:rFonts w:ascii="Consolas" w:hAnsi="Consolas"/>
-          <w:color w:val="CCCCCC"/>
-          <w:sz w:val="21"/>
-          <w:szCs w:val="21"/>
-        </w:rPr>
-        <w:t xml:space="preserve"> </w:t>
-      </w:r>
-      <w:r>
-        <w:rPr>
-          <w:rFonts w:ascii="Consolas" w:hAnsi="Consolas"/>
-          <w:color w:val="DCDCAA"/>
-          <w:sz w:val="21"/>
-          <w:szCs w:val="21"/>
-        </w:rPr>
-        <w:t>error</w:t>
-      </w:r>
-      <w:r>
-        <w:rPr>
-          <w:rFonts w:ascii="Consolas" w:hAnsi="Consolas"/>
-          <w:color w:val="CCCCCC"/>
-          <w:sz w:val="21"/>
-          <w:szCs w:val="21"/>
-        </w:rPr>
-        <w:t>(</w:t>
-      </w:r>
-      <w:r>
-        <w:rPr>
-          <w:rFonts w:ascii="Consolas" w:hAnsi="Consolas"/>
-          <w:color w:val="B5CEA8"/>
-          <w:sz w:val="21"/>
-          <w:szCs w:val="21"/>
-        </w:rPr>
-        <w:t>403</w:t>
-      </w:r>
-      <w:r>
-        <w:rPr>
-          <w:rFonts w:ascii="Consolas" w:hAnsi="Consolas"/>
-          <w:color w:val="CCCCCC"/>
-          <w:sz w:val="21"/>
-          <w:szCs w:val="21"/>
-        </w:rPr>
-        <w:t xml:space="preserve">, </w:t>
-      </w:r>
-      <w:r>
-        <w:rPr>
-          <w:rFonts w:ascii="Consolas" w:hAnsi="Consolas"/>
-          <w:color w:val="CE9178"/>
-          <w:sz w:val="21"/>
-          <w:szCs w:val="21"/>
-        </w:rPr>
-        <w:t>'Admin access required'</w:t>
-      </w:r>
-      <w:r>
-        <w:rPr>
-          <w:rFonts w:ascii="Consolas" w:hAnsi="Consolas"/>
-          <w:color w:val="CCCCCC"/>
-          <w:sz w:val="21"/>
-          <w:szCs w:val="21"/>
-        </w:rPr>
-        <w:t>);</w:t>
-      </w:r>
     </w:p>
     <w:p>
       <w:pPr>
@@ -6964,7 +7282,16 @@
           <w:sz w:val="21"/>
           <w:szCs w:val="21"/>
         </w:rPr>
-        <w:t>  }</w:t>
+        <w:t xml:space="preserve">  </w:t>
+      </w:r>
+      <w:r>
+        <w:rPr>
+          <w:rFonts w:ascii="Consolas" w:hAnsi="Consolas"/>
+          <w:color w:val="6A9955"/>
+          <w:sz w:val="21"/>
+          <w:szCs w:val="21"/>
+        </w:rPr>
+        <w:t>// Layer 2: Check if admin role</w:t>
       </w:r>
     </w:p>
     <w:p>
@@ -6978,6 +7305,107 @@
           <w:szCs w:val="21"/>
         </w:rPr>
       </w:pPr>
+      <w:r>
+        <w:rPr>
+          <w:rFonts w:ascii="Consolas" w:hAnsi="Consolas"/>
+          <w:color w:val="CCCCCC"/>
+          <w:sz w:val="21"/>
+          <w:szCs w:val="21"/>
+        </w:rPr>
+        <w:t xml:space="preserve">  </w:t>
+      </w:r>
+      <w:r>
+        <w:rPr>
+          <w:rFonts w:ascii="Consolas" w:hAnsi="Consolas"/>
+          <w:color w:val="C586C0"/>
+          <w:sz w:val="21"/>
+          <w:szCs w:val="21"/>
+        </w:rPr>
+        <w:t>if</w:t>
+      </w:r>
+      <w:r>
+        <w:rPr>
+          <w:rFonts w:ascii="Consolas" w:hAnsi="Consolas"/>
+          <w:color w:val="CCCCCC"/>
+          <w:sz w:val="21"/>
+          <w:szCs w:val="21"/>
+        </w:rPr>
+        <w:t xml:space="preserve"> (</w:t>
+      </w:r>
+      <w:proofErr w:type="spellStart"/>
+      <w:r>
+        <w:rPr>
+          <w:rFonts w:ascii="Consolas" w:hAnsi="Consolas"/>
+          <w:color w:val="4FC1FF"/>
+          <w:sz w:val="21"/>
+          <w:szCs w:val="21"/>
+        </w:rPr>
+        <w:t>fullUser</w:t>
+      </w:r>
+      <w:r>
+        <w:rPr>
+          <w:rFonts w:ascii="Consolas" w:hAnsi="Consolas"/>
+          <w:color w:val="CCCCCC"/>
+          <w:sz w:val="21"/>
+          <w:szCs w:val="21"/>
+        </w:rPr>
+        <w:t>.</w:t>
+      </w:r>
+      <w:r>
+        <w:rPr>
+          <w:rFonts w:ascii="Consolas" w:hAnsi="Consolas"/>
+          <w:color w:val="9CDCFE"/>
+          <w:sz w:val="21"/>
+          <w:szCs w:val="21"/>
+        </w:rPr>
+        <w:t>role</w:t>
+      </w:r>
+      <w:proofErr w:type="spellEnd"/>
+      <w:r>
+        <w:rPr>
+          <w:rFonts w:ascii="Consolas" w:hAnsi="Consolas"/>
+          <w:color w:val="CCCCCC"/>
+          <w:sz w:val="21"/>
+          <w:szCs w:val="21"/>
+        </w:rPr>
+        <w:t xml:space="preserve"> </w:t>
+      </w:r>
+      <w:r>
+        <w:rPr>
+          <w:rFonts w:ascii="Consolas" w:hAnsi="Consolas"/>
+          <w:color w:val="D4D4D4"/>
+          <w:sz w:val="21"/>
+          <w:szCs w:val="21"/>
+        </w:rPr>
+        <w:t>!==</w:t>
+      </w:r>
+      <w:r>
+        <w:rPr>
+          <w:rFonts w:ascii="Consolas" w:hAnsi="Consolas"/>
+          <w:color w:val="CCCCCC"/>
+          <w:sz w:val="21"/>
+          <w:szCs w:val="21"/>
+        </w:rPr>
+        <w:t xml:space="preserve"> </w:t>
+      </w:r>
+      <w:r>
+        <w:rPr>
+          <w:rFonts w:ascii="Consolas" w:hAnsi="Consolas"/>
+          <w:color w:val="CE9178"/>
+          <w:sz w:val="21"/>
+          <w:szCs w:val="21"/>
+        </w:rPr>
+        <w:t>'admin'</w:t>
+      </w:r>
+      <w:r>
+        <w:rPr>
+          <w:rFonts w:ascii="Consolas" w:hAnsi="Consolas"/>
+          <w:color w:val="CCCCCC"/>
+          <w:sz w:val="21"/>
+          <w:szCs w:val="21"/>
+        </w:rPr>
+        <w:t>) {</w:t>
+      </w:r>
     </w:p>
     <w:p>
       <w:pPr>
@@ -6997,7 +7425,7 @@
           <w:sz w:val="21"/>
           <w:szCs w:val="21"/>
         </w:rPr>
-        <w:t xml:space="preserve">  </w:t>
+        <w:t xml:space="preserve">    </w:t>
       </w:r>
       <w:r>
         <w:rPr>
@@ -7006,16 +7434,70 @@
           <w:sz w:val="21"/>
           <w:szCs w:val="21"/>
         </w:rPr>
-        <w:t>return</w:t>
-      </w:r>
-      <w:r>
-        <w:rPr>
-          <w:rFonts w:ascii="Consolas" w:hAnsi="Consolas"/>
-          <w:color w:val="CCCCCC"/>
-          <w:sz w:val="21"/>
-          <w:szCs w:val="21"/>
-        </w:rPr>
-        <w:t xml:space="preserve"> {</w:t>
+        <w:t>throw</w:t>
+      </w:r>
+      <w:r>
+        <w:rPr>
+          <w:rFonts w:ascii="Consolas" w:hAnsi="Consolas"/>
+          <w:color w:val="CCCCCC"/>
+          <w:sz w:val="21"/>
+          <w:szCs w:val="21"/>
+        </w:rPr>
+        <w:t xml:space="preserve"> </w:t>
+      </w:r>
+      <w:r>
+        <w:rPr>
+          <w:rFonts w:ascii="Consolas" w:hAnsi="Consolas"/>
+          <w:color w:val="DCDCAA"/>
+          <w:sz w:val="21"/>
+          <w:szCs w:val="21"/>
+        </w:rPr>
+        <w:t>error</w:t>
+      </w:r>
+      <w:r>
+        <w:rPr>
+          <w:rFonts w:ascii="Consolas" w:hAnsi="Consolas"/>
+          <w:color w:val="CCCCCC"/>
+          <w:sz w:val="21"/>
+          <w:szCs w:val="21"/>
+        </w:rPr>
+        <w:t>(</w:t>
+      </w:r>
+      <w:r>
+        <w:rPr>
+          <w:rFonts w:ascii="Consolas" w:hAnsi="Consolas"/>
+          <w:color w:val="B5CEA8"/>
+          <w:sz w:val="21"/>
+          <w:szCs w:val="21"/>
+        </w:rPr>
+        <w:t>403</w:t>
+      </w:r>
+      <w:r>
+        <w:rPr>
+          <w:rFonts w:ascii="Consolas" w:hAnsi="Consolas"/>
+          <w:color w:val="CCCCCC"/>
+          <w:sz w:val="21"/>
+          <w:szCs w:val="21"/>
+        </w:rPr>
+        <w:t xml:space="preserve">, </w:t>
+      </w:r>
+      <w:r>
+        <w:rPr>
+          <w:rFonts w:ascii="Consolas" w:hAnsi="Consolas"/>
+          <w:color w:val="CE9178"/>
+          <w:sz w:val="21"/>
+          <w:szCs w:val="21"/>
+        </w:rPr>
+        <w:t>'Admin access required'</w:t>
+      </w:r>
+      <w:r>
+        <w:rPr>
+          <w:rFonts w:ascii="Consolas" w:hAnsi="Consolas"/>
+          <w:color w:val="CCCCCC"/>
+          <w:sz w:val="21"/>
+          <w:szCs w:val="21"/>
+        </w:rPr>
+        <w:t>);</w:t>
       </w:r>
     </w:p>
     <w:p>
@@ -7036,52 +7518,7 @@
           <w:sz w:val="21"/>
           <w:szCs w:val="21"/>
         </w:rPr>
-        <w:t xml:space="preserve">    </w:t>
-      </w:r>
-      <w:r>
-        <w:rPr>
-          <w:rFonts w:ascii="Consolas" w:hAnsi="Consolas"/>
-          <w:color w:val="9CDCFE"/>
-          <w:sz w:val="21"/>
-          <w:szCs w:val="21"/>
-        </w:rPr>
-        <w:t>user:</w:t>
-      </w:r>
-      <w:r>
-        <w:rPr>
-          <w:rFonts w:ascii="Consolas" w:hAnsi="Consolas"/>
-          <w:color w:val="CCCCCC"/>
-          <w:sz w:val="21"/>
-          <w:szCs w:val="21"/>
-        </w:rPr>
-        <w:t xml:space="preserve"> </w:t>
-      </w:r>
-      <w:r>
-        <w:rPr>
-          <w:rFonts w:ascii="Consolas" w:hAnsi="Consolas"/>
-          <w:color w:val="9CDCFE"/>
-          <w:sz w:val="21"/>
-          <w:szCs w:val="21"/>
-        </w:rPr>
-        <w:t>locals</w:t>
-      </w:r>
-      <w:r>
-        <w:rPr>
-          <w:rFonts w:ascii="Consolas" w:hAnsi="Consolas"/>
-          <w:color w:val="CCCCCC"/>
-          <w:sz w:val="21"/>
-          <w:szCs w:val="21"/>
-        </w:rPr>
-        <w:t>.</w:t>
-      </w:r>
-      <w:r>
-        <w:rPr>
-          <w:rFonts w:ascii="Consolas" w:hAnsi="Consolas"/>
-          <w:color w:val="9CDCFE"/>
-          <w:sz w:val="21"/>
-          <w:szCs w:val="21"/>
-        </w:rPr>
-        <w:t>user</w:t>
+        <w:t>  }</w:t>
       </w:r>
     </w:p>
     <w:p>
@@ -7095,15 +7532,6 @@
           <w:szCs w:val="21"/>
         </w:rPr>
       </w:pPr>
-      <w:r>
-        <w:rPr>
-          <w:rFonts w:ascii="Consolas" w:hAnsi="Consolas"/>
-          <w:color w:val="CCCCCC"/>
-          <w:sz w:val="21"/>
-          <w:szCs w:val="21"/>
-        </w:rPr>
-        <w:t>  };</w:t>
-      </w:r>
     </w:p>
     <w:p>
       <w:pPr>
@@ -7123,28 +7551,175 @@
           <w:sz w:val="21"/>
           <w:szCs w:val="21"/>
         </w:rPr>
+        <w:t xml:space="preserve">  </w:t>
+      </w:r>
+      <w:r>
+        <w:rPr>
+          <w:rFonts w:ascii="Consolas" w:hAnsi="Consolas"/>
+          <w:color w:val="C586C0"/>
+          <w:sz w:val="21"/>
+          <w:szCs w:val="21"/>
+        </w:rPr>
+        <w:t>return</w:t>
+      </w:r>
+      <w:r>
+        <w:rPr>
+          <w:rFonts w:ascii="Consolas" w:hAnsi="Consolas"/>
+          <w:color w:val="CCCCCC"/>
+          <w:sz w:val="21"/>
+          <w:szCs w:val="21"/>
+        </w:rPr>
+        <w:t xml:space="preserve"> {</w:t>
+      </w:r>
+    </w:p>
+    <w:p>
+      <w:pPr>
+        <w:shd w:val="clear" w:color="auto" w:fill="1F1F1F"/>
+        <w:spacing w:line="285" w:lineRule="atLeast"/>
+        <w:rPr>
+          <w:rFonts w:ascii="Consolas" w:hAnsi="Consolas"/>
+          <w:color w:val="CCCCCC"/>
+          <w:sz w:val="21"/>
+          <w:szCs w:val="21"/>
+        </w:rPr>
+      </w:pPr>
+      <w:r>
+        <w:rPr>
+          <w:rFonts w:ascii="Consolas" w:hAnsi="Consolas"/>
+          <w:color w:val="CCCCCC"/>
+          <w:sz w:val="21"/>
+          <w:szCs w:val="21"/>
+        </w:rPr>
+        <w:t xml:space="preserve">    </w:t>
+      </w:r>
+      <w:r>
+        <w:rPr>
+          <w:rFonts w:ascii="Consolas" w:hAnsi="Consolas"/>
+          <w:color w:val="9CDCFE"/>
+          <w:sz w:val="21"/>
+          <w:szCs w:val="21"/>
+        </w:rPr>
+        <w:t>user:</w:t>
+      </w:r>
+      <w:r>
+        <w:rPr>
+          <w:rFonts w:ascii="Consolas" w:hAnsi="Consolas"/>
+          <w:color w:val="CCCCCC"/>
+          <w:sz w:val="21"/>
+          <w:szCs w:val="21"/>
+        </w:rPr>
+        <w:t xml:space="preserve"> </w:t>
+      </w:r>
+      <w:proofErr w:type="spellStart"/>
+      <w:r>
+        <w:rPr>
+          <w:rFonts w:ascii="Consolas" w:hAnsi="Consolas"/>
+          <w:color w:val="4FC1FF"/>
+          <w:sz w:val="21"/>
+          <w:szCs w:val="21"/>
+        </w:rPr>
+        <w:t>fullUser</w:t>
+      </w:r>
+      <w:proofErr w:type="spellEnd"/>
+    </w:p>
+    <w:p>
+      <w:pPr>
+        <w:shd w:val="clear" w:color="auto" w:fill="1F1F1F"/>
+        <w:spacing w:line="285" w:lineRule="atLeast"/>
+        <w:rPr>
+          <w:rFonts w:ascii="Consolas" w:hAnsi="Consolas"/>
+          <w:color w:val="CCCCCC"/>
+          <w:sz w:val="21"/>
+          <w:szCs w:val="21"/>
+        </w:rPr>
+      </w:pPr>
+      <w:r>
+        <w:rPr>
+          <w:rFonts w:ascii="Consolas" w:hAnsi="Consolas"/>
+          <w:color w:val="CCCCCC"/>
+          <w:sz w:val="21"/>
+          <w:szCs w:val="21"/>
+        </w:rPr>
+        <w:t>  };</w:t>
+      </w:r>
+    </w:p>
+    <w:p>
+      <w:pPr>
+        <w:shd w:val="clear" w:color="auto" w:fill="1F1F1F"/>
+        <w:spacing w:line="285" w:lineRule="atLeast"/>
+        <w:rPr>
+          <w:rFonts w:ascii="Consolas" w:hAnsi="Consolas"/>
+          <w:color w:val="CCCCCC"/>
+          <w:sz w:val="21"/>
+          <w:szCs w:val="21"/>
+        </w:rPr>
+      </w:pPr>
+      <w:r>
+        <w:rPr>
+          <w:rFonts w:ascii="Consolas" w:hAnsi="Consolas"/>
+          <w:color w:val="CCCCCC"/>
+          <w:sz w:val="21"/>
+          <w:szCs w:val="21"/>
+        </w:rPr>
         <w:t>}</w:t>
       </w:r>
     </w:p>
-    <w:p/>
-    <w:p/>
+    <w:p>
+      <w:pPr>
+        <w:shd w:val="clear" w:color="auto" w:fill="1F1F1F"/>
+        <w:spacing w:line="285" w:lineRule="atLeast"/>
+        <w:rPr>
+          <w:rFonts w:ascii="Consolas" w:hAnsi="Consolas"/>
+          <w:color w:val="CCCCCC"/>
+          <w:sz w:val="21"/>
+          <w:szCs w:val="21"/>
+        </w:rPr>
+      </w:pPr>
+    </w:p>
+    <w:p>
+      <w:pPr>
+        <w:shd w:val="clear" w:color="auto" w:fill="1F1F1F"/>
+        <w:spacing w:line="285" w:lineRule="atLeast"/>
+        <w:jc w:val="both"/>
+        <w:rPr>
+          <w:rFonts w:ascii="Consolas" w:hAnsi="Consolas"/>
+          <w:color w:val="CCCCCC"/>
+          <w:sz w:val="21"/>
+          <w:szCs w:val="21"/>
+        </w:rPr>
+      </w:pPr>
+    </w:p>
+    <w:p>
+      <w:pPr>
+        <w:jc w:val="both"/>
+      </w:pPr>
+    </w:p>
     <w:p>
       <w:pPr>
         <w:pStyle w:val="Heading2"/>
+        <w:jc w:val="both"/>
       </w:pPr>
       <w:r>
         <w:t>Copy the categories folder</w:t>
       </w:r>
     </w:p>
     <w:p>
+      <w:pPr>
+        <w:jc w:val="both"/>
+      </w:pPr>
       <w:r>
         <w:t>Copy the categories folder into the admin folder. We want to change this page for the admin, but we can use the existing categories code as a starting point.</w:t>
       </w:r>
     </w:p>
-    <w:p/>
+    <w:p>
+      <w:pPr>
+        <w:jc w:val="both"/>
+      </w:pPr>
+    </w:p>
     <w:p>
       <w:pPr>
         <w:pStyle w:val="Heading2"/>
+        <w:jc w:val="both"/>
       </w:pPr>
       <w:bookmarkStart w:id="7" w:name="_Toc222413905"/>
       <w:r>
@@ -7153,6 +7728,9 @@
       <w:bookmarkEnd w:id="7"/>
     </w:p>
     <w:p>
+      <w:pPr>
+        <w:jc w:val="both"/>
+      </w:pPr>
       <w:r>
         <w:t>If you run the DB Browser (S</w:t>
       </w:r>
@@ -7163,21 +7741,36 @@
         <w:t>Lite), and open the user table, you can change the role of a user to admin. This allows you test regular and an admin user.</w:t>
       </w:r>
     </w:p>
-    <w:p/>
-    <w:p>
+    <w:p>
+      <w:pPr>
+        <w:jc w:val="both"/>
+      </w:pPr>
+    </w:p>
+    <w:p>
+      <w:pPr>
+        <w:jc w:val="both"/>
+      </w:pPr>
       <w:r>
         <w:t>Test that when the admin logs in they are redirected to the new admin menu. Also, test that categories work.</w:t>
       </w:r>
     </w:p>
     <w:p>
+      <w:pPr>
+        <w:jc w:val="both"/>
+      </w:pPr>
       <w:r>
         <w:t>Make sure you have removed the cart menu option for the admin user.</w:t>
       </w:r>
     </w:p>
-    <w:p/>
+    <w:p>
+      <w:pPr>
+        <w:jc w:val="both"/>
+      </w:pPr>
+    </w:p>
     <w:p>
       <w:pPr>
         <w:pStyle w:val="Heading2"/>
+        <w:jc w:val="both"/>
       </w:pPr>
       <w:r>
         <w:t xml:space="preserve">Changes to </w:t>
@@ -7191,6 +7784,7 @@
     </w:p>
     <w:p>
       <w:pPr>
+        <w:jc w:val="both"/>
         <w:rPr>
           <w:b/>
           <w:bCs/>
@@ -7200,96 +7794,131 @@
         <w:t xml:space="preserve">Instead of just displaying the category information, I want to give CRUD functionality to the admin. </w:t>
       </w:r>
     </w:p>
-    <w:p/>
-    <w:p>
-      <w:r>
-        <w:t>I have updated the two files:</w:t>
-      </w:r>
-    </w:p>
-    <w:p>
+    <w:p>
+      <w:pPr>
+        <w:jc w:val="both"/>
+      </w:pPr>
+    </w:p>
+    <w:p>
+      <w:pPr>
+        <w:jc w:val="both"/>
+      </w:pPr>
+      <w:r>
+        <w:t>I have updated the two files</w:t>
+      </w:r>
+      <w:r>
+        <w:t xml:space="preserve"> in the </w:t>
+      </w:r>
       <w:r>
         <w:rPr>
           <w:b/>
           <w:bCs/>
         </w:rPr>
-        <w:t>+page.svelte</w:t>
-      </w:r>
-      <w:r>
-        <w:t xml:space="preserve"> : added CRUD functionality</w:t>
-      </w:r>
-    </w:p>
-    <w:p>
+        <w:t>admin/categories</w:t>
+      </w:r>
       <w:r>
         <w:rPr>
           <w:b/>
           <w:bCs/>
         </w:rPr>
-        <w:t>+page.server.js</w:t>
-      </w:r>
-      <w:r>
-        <w:t xml:space="preserve"> : updated error checking. For example, if the user tries to delete a </w:t>
-      </w:r>
-      <w:r>
-        <w:t>category</w:t>
-      </w:r>
-      <w:r>
-        <w:t>, ensure that no errors are thrown.</w:t>
-      </w:r>
-    </w:p>
-    <w:p/>
-    <w:p>
-      <w:r>
-        <w:t>Rather than copy and paste the code here, I have provided this file for you on Brightspace.</w:t>
-      </w:r>
-      <w:r>
-        <w:t xml:space="preserve"> </w:t>
-      </w:r>
-      <w:r>
-        <w:t>Copy the code for these two files</w:t>
-      </w:r>
-      <w:r>
-        <w:t xml:space="preserve"> </w:t>
-      </w:r>
-      <w:r>
-        <w:t>(</w:t>
-      </w:r>
-      <w:r>
-        <w:t>/admin/categories/</w:t>
-      </w:r>
-      <w:r>
-        <w:t>)</w:t>
-      </w:r>
-      <w:r>
-        <w:t xml:space="preserve"> </w:t>
-      </w:r>
-      <w:r>
-        <w:t>from my solution. Read the comments to ensure you have some understanding of the code additions and changes.</w:t>
-      </w:r>
-    </w:p>
-    <w:p/>
-    <w:p>
-      <w:r>
-        <w:t>Now test this page to see it working.</w:t>
-      </w:r>
-    </w:p>
-    <w:p/>
-    <w:p>
-      <w:pPr>
-        <w:pStyle w:val="Heading2"/>
-      </w:pPr>
-      <w:r>
-        <w:t xml:space="preserve">Changes to Admin </w:t>
-      </w:r>
-      <w:r>
-        <w:t>Users</w:t>
-      </w:r>
-    </w:p>
-    <w:p>
-      <w:pPr>
+        <w:t xml:space="preserve"> folder</w:t>
+      </w:r>
+      <w:r>
         <w:rPr>
           <w:b/>
           <w:bCs/>
         </w:rPr>
+        <w:t>:</w:t>
+      </w:r>
+    </w:p>
+    <w:p>
+      <w:pPr>
+        <w:jc w:val="both"/>
+      </w:pPr>
+      <w:r>
+        <w:rPr>
+          <w:b/>
+          <w:bCs/>
+        </w:rPr>
+        <w:t>+</w:t>
+      </w:r>
+      <w:proofErr w:type="spellStart"/>
+      <w:r>
+        <w:rPr>
+          <w:b/>
+          <w:bCs/>
+        </w:rPr>
+        <w:t>page.svelte</w:t>
+      </w:r>
+      <w:proofErr w:type="spellEnd"/>
+      <w:r>
+        <w:t xml:space="preserve"> : added CRUD functionality</w:t>
+      </w:r>
+    </w:p>
+    <w:p>
+      <w:pPr>
+        <w:jc w:val="both"/>
+      </w:pPr>
+      <w:r>
+        <w:rPr>
+          <w:b/>
+          <w:bCs/>
+        </w:rPr>
+        <w:t>+page.server.js</w:t>
+      </w:r>
+      <w:r>
+        <w:t xml:space="preserve"> : updated error checking. For example, if the user tries to delete a category, ensure that no errors are thrown.</w:t>
+      </w:r>
+    </w:p>
+    <w:p>
+      <w:pPr>
+        <w:jc w:val="both"/>
+      </w:pPr>
+    </w:p>
+    <w:p>
+      <w:pPr>
+        <w:jc w:val="both"/>
+      </w:pPr>
+      <w:r>
+        <w:t xml:space="preserve">Rather than copy and paste the code here, I have provided this file for you on Brightspace. Copy the code for these two files </w:t>
+      </w:r>
+      <w:r>
+        <w:t>(/admin/categories/)</w:t>
+      </w:r>
+      <w:r>
+        <w:t xml:space="preserve"> from my solution. Read the comments to ensure you have some understanding of the code additions and changes.</w:t>
+      </w:r>
+    </w:p>
+    <w:p>
+      <w:pPr>
+        <w:jc w:val="both"/>
+      </w:pPr>
+    </w:p>
+    <w:p>
+      <w:pPr>
+        <w:jc w:val="both"/>
+      </w:pPr>
+      <w:r>
+        <w:t>Now test this page to see it working.</w:t>
+      </w:r>
+    </w:p>
+    <w:p>
+      <w:pPr>
+        <w:jc w:val="both"/>
+      </w:pPr>
+    </w:p>
+    <w:p>
+      <w:pPr>
+        <w:pStyle w:val="Heading2"/>
+        <w:jc w:val="both"/>
+      </w:pPr>
+      <w:r>
+        <w:t>Changes to Admin Users</w:t>
+      </w:r>
+    </w:p>
+    <w:p>
+      <w:pPr>
+        <w:jc w:val="both"/>
       </w:pPr>
       <w:r>
         <w:t>I want to do the same for Users</w:t>
@@ -7300,14 +7929,110 @@
       <w:r>
         <w:t xml:space="preserve"> </w:t>
       </w:r>
-      <w:r>
-        <w:t>There is more functionality on this page as the admin can change the user role and reset passwords. Therefore, this page is slightly more complicated that the categories page. Therefore, I have provided the code (2 files) with comments in my solution.</w:t>
-      </w:r>
-    </w:p>
-    <w:p/>
-    <w:p>
-      <w:r>
+    </w:p>
+    <w:p>
+      <w:pPr>
+        <w:jc w:val="both"/>
+      </w:pPr>
+      <w:r>
+        <w:t xml:space="preserve">There is more </w:t>
+      </w:r>
+      <w:r>
+        <w:t xml:space="preserve">complexity for this page </w:t>
+      </w:r>
+      <w:r>
+        <w:t xml:space="preserve">as </w:t>
+      </w:r>
+      <w:r>
+        <w:t xml:space="preserve">we need to use the Better Auth framework too. </w:t>
+      </w:r>
+      <w:r>
+        <w:t>Therefore, I have provided the code (2 files</w:t>
+      </w:r>
+      <w:r>
+        <w:t xml:space="preserve"> </w:t>
+      </w:r>
+      <w:r>
+        <w:t>with comments</w:t>
+      </w:r>
+      <w:r>
+        <w:t>)</w:t>
+      </w:r>
+      <w:r>
+        <w:t xml:space="preserve"> in my solution.</w:t>
+      </w:r>
+    </w:p>
+    <w:p>
+      <w:pPr>
+        <w:jc w:val="both"/>
+      </w:pPr>
+    </w:p>
+    <w:p>
+      <w:pPr>
+        <w:jc w:val="both"/>
+      </w:pPr>
+      <w:r>
+        <w:t xml:space="preserve">I have updated the two files in the </w:t>
+      </w:r>
+      <w:r>
+        <w:rPr>
+          <w:b/>
+          <w:bCs/>
+        </w:rPr>
+        <w:t>admin/categories folder:</w:t>
+      </w:r>
+    </w:p>
+    <w:p>
+      <w:pPr>
+        <w:jc w:val="both"/>
+      </w:pPr>
+      <w:r>
+        <w:rPr>
+          <w:b/>
+          <w:bCs/>
+        </w:rPr>
+        <w:t>+</w:t>
+      </w:r>
+      <w:proofErr w:type="spellStart"/>
+      <w:r>
+        <w:rPr>
+          <w:b/>
+          <w:bCs/>
+        </w:rPr>
+        <w:t>page.svelte</w:t>
+      </w:r>
+      <w:proofErr w:type="spellEnd"/>
+      <w:r>
+        <w:t xml:space="preserve"> : added CRUD functionality</w:t>
+      </w:r>
+    </w:p>
+    <w:p>
+      <w:pPr>
+        <w:jc w:val="both"/>
+        <w:rPr>
+          <w:b/>
+          <w:bCs/>
+        </w:rPr>
+      </w:pPr>
+      <w:r>
+        <w:rPr>
+          <w:b/>
+          <w:bCs/>
+        </w:rPr>
         <w:lastRenderedPageBreak/>
+        <w:t>+page.server.js</w:t>
+      </w:r>
+    </w:p>
+    <w:p>
+      <w:pPr>
+        <w:jc w:val="both"/>
+      </w:pPr>
+    </w:p>
+    <w:p>
+      <w:pPr>
+        <w:jc w:val="both"/>
+      </w:pPr>
+      <w:r>
         <w:t xml:space="preserve">Copy the code for these two files </w:t>
       </w:r>
       <w:r>
@@ -7323,23 +8048,363 @@
         <w:t xml:space="preserve"> from my solution. Read the comments to ensure you have some understanding of the code additions and changes.</w:t>
       </w:r>
     </w:p>
-    <w:p/>
-    <w:p>
-      <w:r>
-        <w:t>Now test this page to see it working.</w:t>
-      </w:r>
-    </w:p>
-    <w:p/>
-    <w:p/>
+    <w:p>
+      <w:pPr>
+        <w:jc w:val="both"/>
+      </w:pPr>
+    </w:p>
+    <w:p>
+      <w:pPr>
+        <w:jc w:val="both"/>
+      </w:pPr>
+      <w:r>
+        <w:t xml:space="preserve">As part of adding this functionality, I needed to create another file and make small changes to others. </w:t>
+      </w:r>
+      <w:r>
+        <w:t>Y</w:t>
+      </w:r>
+      <w:r>
+        <w:t xml:space="preserve">ou can copy these </w:t>
+      </w:r>
+      <w:r>
+        <w:t>files</w:t>
+      </w:r>
+      <w:r>
+        <w:t xml:space="preserve"> from my solution. Below is a list of the files and what has been added/changed. Again, take some time to review the code and comments.</w:t>
+      </w:r>
+    </w:p>
+    <w:p>
+      <w:pPr>
+        <w:jc w:val="both"/>
+      </w:pPr>
+    </w:p>
+    <w:p>
+      <w:pPr>
+        <w:jc w:val="both"/>
+        <w:rPr>
+          <w:b/>
+          <w:bCs/>
+        </w:rPr>
+      </w:pPr>
+      <w:r>
+        <w:rPr>
+          <w:b/>
+          <w:bCs/>
+        </w:rPr>
+        <w:t>/lib/server/</w:t>
+      </w:r>
+      <w:proofErr w:type="spellStart"/>
+      <w:r>
+        <w:rPr>
+          <w:b/>
+          <w:bCs/>
+        </w:rPr>
+        <w:t>db</w:t>
+      </w:r>
+      <w:proofErr w:type="spellEnd"/>
+      <w:r>
+        <w:rPr>
+          <w:b/>
+          <w:bCs/>
+        </w:rPr>
+        <w:t>/</w:t>
+      </w:r>
+      <w:r>
+        <w:rPr>
+          <w:b/>
+          <w:bCs/>
+        </w:rPr>
+        <w:t xml:space="preserve"> a</w:t>
+      </w:r>
+      <w:r>
+        <w:rPr>
+          <w:b/>
+          <w:bCs/>
+        </w:rPr>
+        <w:t>uth.schema.js</w:t>
+      </w:r>
+    </w:p>
+    <w:p>
+      <w:pPr>
+        <w:jc w:val="both"/>
+      </w:pPr>
+      <w:r>
+        <w:t>Added Better Auth admin plugin fields to the user and session tables.</w:t>
+      </w:r>
+    </w:p>
+    <w:p>
+      <w:pPr>
+        <w:jc w:val="both"/>
+      </w:pPr>
+    </w:p>
+    <w:p>
+      <w:pPr>
+        <w:jc w:val="both"/>
+        <w:rPr>
+          <w:b/>
+          <w:bCs/>
+        </w:rPr>
+      </w:pPr>
+      <w:r>
+        <w:rPr>
+          <w:b/>
+          <w:bCs/>
+        </w:rPr>
+        <w:t>/lib/server/</w:t>
+      </w:r>
+      <w:r>
+        <w:rPr>
+          <w:b/>
+          <w:bCs/>
+        </w:rPr>
+        <w:t xml:space="preserve"> </w:t>
+      </w:r>
+      <w:r>
+        <w:rPr>
+          <w:b/>
+          <w:bCs/>
+        </w:rPr>
+        <w:t>auth.js</w:t>
+      </w:r>
+    </w:p>
+    <w:p>
+      <w:pPr>
+        <w:jc w:val="both"/>
+      </w:pPr>
+      <w:r>
+        <w:t xml:space="preserve">Added </w:t>
+      </w:r>
+      <w:r>
+        <w:t xml:space="preserve">Better Auth </w:t>
+      </w:r>
+      <w:r>
+        <w:t>admin plugins needed</w:t>
+      </w:r>
+    </w:p>
+    <w:p>
+      <w:pPr>
+        <w:jc w:val="both"/>
+      </w:pPr>
+    </w:p>
+    <w:p>
+      <w:pPr>
+        <w:jc w:val="both"/>
+        <w:rPr>
+          <w:b/>
+          <w:bCs/>
+        </w:rPr>
+      </w:pPr>
+      <w:r>
+        <w:rPr>
+          <w:b/>
+          <w:bCs/>
+        </w:rPr>
+        <w:t xml:space="preserve">/lib/server/services/ </w:t>
+      </w:r>
+      <w:r>
+        <w:rPr>
+          <w:b/>
+          <w:bCs/>
+        </w:rPr>
+        <w:t>admin-users-service.js</w:t>
+      </w:r>
+      <w:r>
+        <w:rPr>
+          <w:b/>
+          <w:bCs/>
+        </w:rPr>
+        <w:t xml:space="preserve"> </w:t>
+      </w:r>
+    </w:p>
+    <w:p>
+      <w:pPr>
+        <w:jc w:val="both"/>
+      </w:pPr>
+      <w:r>
+        <w:t xml:space="preserve">Created a </w:t>
+      </w:r>
+      <w:r>
+        <w:rPr>
+          <w:b/>
+          <w:bCs/>
+        </w:rPr>
+        <w:t>new</w:t>
+      </w:r>
+      <w:r>
+        <w:t xml:space="preserve"> users service for the admin user. It </w:t>
+      </w:r>
+      <w:r>
+        <w:t>is important not to mix regular and admin user functionality. Therefore, I have created a separate service file for the admin.</w:t>
+      </w:r>
+    </w:p>
+    <w:p>
+      <w:pPr>
+        <w:jc w:val="both"/>
+      </w:pPr>
+    </w:p>
+    <w:p>
+      <w:pPr>
+        <w:jc w:val="both"/>
+        <w:rPr>
+          <w:b/>
+          <w:bCs/>
+        </w:rPr>
+      </w:pPr>
+      <w:r>
+        <w:rPr>
+          <w:b/>
+          <w:bCs/>
+        </w:rPr>
+        <w:t>Test</w:t>
+      </w:r>
+    </w:p>
+    <w:p>
+      <w:pPr>
+        <w:jc w:val="both"/>
+      </w:pPr>
+      <w:r>
+        <w:t>To test your changes, you will need to:</w:t>
+      </w:r>
+    </w:p>
+    <w:p>
+      <w:pPr>
+        <w:pStyle w:val="ListParagraph"/>
+        <w:numPr>
+          <w:ilvl w:val="0"/>
+          <w:numId w:val="4"/>
+        </w:numPr>
+        <w:jc w:val="both"/>
+      </w:pPr>
+      <w:r>
+        <w:t xml:space="preserve">Delete your database </w:t>
+      </w:r>
+    </w:p>
+    <w:p>
+      <w:pPr>
+        <w:pStyle w:val="ListParagraph"/>
+        <w:numPr>
+          <w:ilvl w:val="0"/>
+          <w:numId w:val="4"/>
+        </w:numPr>
+        <w:jc w:val="both"/>
+      </w:pPr>
+      <w:r>
+        <w:t>Create it again</w:t>
+      </w:r>
+      <w:r>
+        <w:t xml:space="preserve">: </w:t>
+      </w:r>
+      <w:proofErr w:type="spellStart"/>
+      <w:r>
+        <w:rPr>
+          <w:b/>
+          <w:bCs/>
+        </w:rPr>
+        <w:t>npm</w:t>
+      </w:r>
+      <w:proofErr w:type="spellEnd"/>
+      <w:r>
+        <w:rPr>
+          <w:b/>
+          <w:bCs/>
+        </w:rPr>
+        <w:t xml:space="preserve"> run </w:t>
+      </w:r>
+      <w:proofErr w:type="spellStart"/>
+      <w:r>
+        <w:rPr>
+          <w:b/>
+          <w:bCs/>
+        </w:rPr>
+        <w:t>db:pus</w:t>
+      </w:r>
+      <w:r>
+        <w:rPr>
+          <w:b/>
+          <w:bCs/>
+        </w:rPr>
+        <w:t>h</w:t>
+      </w:r>
+      <w:proofErr w:type="spellEnd"/>
+    </w:p>
+    <w:p>
+      <w:pPr>
+        <w:pStyle w:val="ListParagraph"/>
+        <w:numPr>
+          <w:ilvl w:val="0"/>
+          <w:numId w:val="4"/>
+        </w:numPr>
+        <w:jc w:val="both"/>
+      </w:pPr>
+      <w:r>
+        <w:t>Add sample data as before</w:t>
+      </w:r>
+    </w:p>
+    <w:p>
+      <w:pPr>
+        <w:pStyle w:val="ListParagraph"/>
+        <w:numPr>
+          <w:ilvl w:val="0"/>
+          <w:numId w:val="4"/>
+        </w:numPr>
+        <w:jc w:val="both"/>
+      </w:pPr>
+      <w:r>
+        <w:t>Start your server</w:t>
+      </w:r>
+    </w:p>
+    <w:p>
+      <w:pPr>
+        <w:pStyle w:val="ListParagraph"/>
+        <w:numPr>
+          <w:ilvl w:val="0"/>
+          <w:numId w:val="4"/>
+        </w:numPr>
+        <w:jc w:val="both"/>
+      </w:pPr>
+      <w:r>
+        <w:t>Register a new user through your application</w:t>
+      </w:r>
+    </w:p>
+    <w:p>
+      <w:pPr>
+        <w:pStyle w:val="ListParagraph"/>
+        <w:numPr>
+          <w:ilvl w:val="0"/>
+          <w:numId w:val="4"/>
+        </w:numPr>
+        <w:jc w:val="both"/>
+      </w:pPr>
+      <w:r>
+        <w:t xml:space="preserve">Using </w:t>
+      </w:r>
+      <w:r>
+        <w:t>DB SQLite change the user role to admin</w:t>
+      </w:r>
+    </w:p>
+    <w:p>
+      <w:pPr>
+        <w:jc w:val="both"/>
+      </w:pPr>
+    </w:p>
+    <w:p>
+      <w:pPr>
+        <w:jc w:val="both"/>
+      </w:pPr>
+    </w:p>
     <w:p>
       <w:pPr>
         <w:pStyle w:val="Heading1"/>
+        <w:jc w:val="both"/>
       </w:pPr>
       <w:r>
         <w:t>Exercise</w:t>
       </w:r>
     </w:p>
     <w:p>
+      <w:pPr>
+        <w:jc w:val="both"/>
+      </w:pPr>
       <w:r>
         <w:t>Implement what you have just learned (Admin CRUD functionality) to the other pages:</w:t>
       </w:r>
@@ -7351,9 +8416,10 @@
           <w:ilvl w:val="0"/>
           <w:numId w:val="3"/>
         </w:numPr>
-      </w:pPr>
-      <w:r>
-        <w:t>Products</w:t>
+        <w:jc w:val="both"/>
+      </w:pPr>
+      <w:r>
+        <w:t>Orders</w:t>
       </w:r>
     </w:p>
     <w:p>
@@ -7363,16 +8429,30 @@
           <w:ilvl w:val="0"/>
           <w:numId w:val="3"/>
         </w:numPr>
-      </w:pPr>
-      <w:r>
-        <w:t>Orders</w:t>
-      </w:r>
-    </w:p>
-    <w:p/>
-    <w:p/>
-    <w:p/>
-    <w:p>
-      <w:pPr>
+        <w:jc w:val="both"/>
+      </w:pPr>
+      <w:r>
+        <w:t>Products</w:t>
+      </w:r>
+    </w:p>
+    <w:p>
+      <w:pPr>
+        <w:jc w:val="both"/>
+      </w:pPr>
+    </w:p>
+    <w:p>
+      <w:pPr>
+        <w:jc w:val="both"/>
+      </w:pPr>
+    </w:p>
+    <w:p>
+      <w:pPr>
+        <w:jc w:val="both"/>
+      </w:pPr>
+    </w:p>
+    <w:p>
+      <w:pPr>
+        <w:jc w:val="both"/>
         <w:rPr>
           <w:b/>
           <w:bCs/>
@@ -7381,6 +8461,7 @@
     </w:p>
     <w:p>
       <w:pPr>
+        <w:jc w:val="both"/>
         <w:rPr>
           <w:b/>
           <w:bCs/>
@@ -7389,6 +8470,7 @@
     </w:p>
     <w:p>
       <w:pPr>
+        <w:jc w:val="both"/>
         <w:rPr>
           <w:b/>
           <w:bCs/>
@@ -7559,6 +8641,92 @@
     </w:lvl>
   </w:abstractNum>
   <w:abstractNum w:abstractNumId="1" w15:restartNumberingAfterBreak="0">
+    <w:nsid w:val="54476D6A"/>
+    <w:multiLevelType w:val="hybridMultilevel"/>
+    <w:tmpl w:val="7B9448A2"/>
+    <w:lvl w:ilvl="0" w:tplc="1809000F">
+      <w:start w:val="1"/>
+      <w:numFmt w:val="decimal"/>
+      <w:lvlText w:val="%1."/>
+      <w:lvlJc w:val="left"/>
+      <w:pPr>
+        <w:ind w:left="783" w:hanging="360"/>
+      </w:pPr>
+    </w:lvl>
+    <w:lvl w:ilvl="1" w:tplc="18090019" w:tentative="1">
+      <w:start w:val="1"/>
+      <w:numFmt w:val="lowerLetter"/>
+      <w:lvlText w:val="%2."/>
+      <w:lvlJc w:val="left"/>
+      <w:pPr>
+        <w:ind w:left="1503" w:hanging="360"/>
+      </w:pPr>
+    </w:lvl>
+    <w:lvl w:ilvl="2" w:tplc="1809001B" w:tentative="1">
+      <w:start w:val="1"/>
+      <w:numFmt w:val="lowerRoman"/>
+      <w:lvlText w:val="%3."/>
+      <w:lvlJc w:val="right"/>
+      <w:pPr>
+        <w:ind w:left="2223" w:hanging="180"/>
+      </w:pPr>
+    </w:lvl>
+    <w:lvl w:ilvl="3" w:tplc="1809000F" w:tentative="1">
+      <w:start w:val="1"/>
+      <w:numFmt w:val="decimal"/>
+      <w:lvlText w:val="%4."/>
+      <w:lvlJc w:val="left"/>
+      <w:pPr>
+        <w:ind w:left="2943" w:hanging="360"/>
+      </w:pPr>
+    </w:lvl>
+    <w:lvl w:ilvl="4" w:tplc="18090019" w:tentative="1">
+      <w:start w:val="1"/>
+      <w:numFmt w:val="lowerLetter"/>
+      <w:lvlText w:val="%5."/>
+      <w:lvlJc w:val="left"/>
+      <w:pPr>
+        <w:ind w:left="3663" w:hanging="360"/>
+      </w:pPr>
+    </w:lvl>
+    <w:lvl w:ilvl="5" w:tplc="1809001B" w:tentative="1">
+      <w:start w:val="1"/>
+      <w:numFmt w:val="lowerRoman"/>
+      <w:lvlText w:val="%6."/>
+      <w:lvlJc w:val="right"/>
+      <w:pPr>
+        <w:ind w:left="4383" w:hanging="180"/>
+      </w:pPr>
+    </w:lvl>
+    <w:lvl w:ilvl="6" w:tplc="1809000F" w:tentative="1">
+      <w:start w:val="1"/>
+      <w:numFmt w:val="decimal"/>
+      <w:lvlText w:val="%7."/>
+      <w:lvlJc w:val="left"/>
+      <w:pPr>
+        <w:ind w:left="5103" w:hanging="360"/>
+      </w:pPr>
+    </w:lvl>
+    <w:lvl w:ilvl="7" w:tplc="18090019" w:tentative="1">
+      <w:start w:val="1"/>
+      <w:numFmt w:val="lowerLetter"/>
+      <w:lvlText w:val="%8."/>
+      <w:lvlJc w:val="left"/>
+      <w:pPr>
+        <w:ind w:left="5823" w:hanging="360"/>
+      </w:pPr>
+    </w:lvl>
+    <w:lvl w:ilvl="8" w:tplc="1809001B" w:tentative="1">
+      <w:start w:val="1"/>
+      <w:numFmt w:val="lowerRoman"/>
+      <w:lvlText w:val="%9."/>
+      <w:lvlJc w:val="right"/>
+      <w:pPr>
+        <w:ind w:left="6543" w:hanging="180"/>
+      </w:pPr>
+    </w:lvl>
+  </w:abstractNum>
+  <w:abstractNum w:abstractNumId="2" w15:restartNumberingAfterBreak="0">
     <w:nsid w:val="604A5042"/>
     <w:multiLevelType w:val="multilevel"/>
     <w:tmpl w:val="18090025"/>
@@ -7653,7 +8821,7 @@
       </w:pPr>
     </w:lvl>
   </w:abstractNum>
-  <w:abstractNum w:abstractNumId="2" w15:restartNumberingAfterBreak="0">
+  <w:abstractNum w:abstractNumId="3" w15:restartNumberingAfterBreak="0">
     <w:nsid w:val="70496FB6"/>
     <w:multiLevelType w:val="hybridMultilevel"/>
     <w:tmpl w:val="C0120CAE"/>
@@ -7740,13 +8908,16 @@
     </w:lvl>
   </w:abstractNum>
   <w:num w:numId="1" w16cid:durableId="1873616312">
-    <w:abstractNumId w:val="1"/>
+    <w:abstractNumId w:val="2"/>
   </w:num>
   <w:num w:numId="2" w16cid:durableId="118304822">
     <w:abstractNumId w:val="0"/>
   </w:num>
   <w:num w:numId="3" w16cid:durableId="1037854989">
-    <w:abstractNumId w:val="2"/>
+    <w:abstractNumId w:val="3"/>
+  </w:num>
+  <w:num w:numId="4" w16cid:durableId="541747986">
+    <w:abstractNumId w:val="1"/>
   </w:num>
   <w:numIdMacAtCleanup w:val="2"/>
 </w:numbering>
@@ -8420,7 +9591,6 @@
   <w:style w:type="character" w:default="1" w:styleId="DefaultParagraphFont">
     <w:name w:val="Default Paragraph Font"/>
     <w:uiPriority w:val="1"/>
-    <w:semiHidden/>
     <w:unhideWhenUsed/>
   </w:style>
   <w:style w:type="table" w:default="1" w:styleId="TableNormal">

</xml_diff>